<commit_message>
Deixa claro que o app atende casas, prédios e empresas
Explica o caminho entre cliente e lavador, adiciona a rota por bairro
pras casas e a coluna da rota na conta do documento e do README.

Co-Authored-By: Claude Opus 5.5 <noreply@anthropic.com>
</commit_message>
<xml_diff>
--- a/Lavagem de Carro Delivery.docx
+++ b/Lavagem de Carro Delivery.docx
@@ -75,7 +75,7 @@
           <w:sz w:val="22"/>
           <w:szCs w:val="22"/>
         </w:rPr>
-        <w:t>Um app em que o cliente agenda a lavagem e vê a ficha de quem vai lavar o carro, como no Uber. O lavador vai até o carro, onde ele estiver estacionado.</w:t>
+        <w:t>Um app que liga quem quer o carro lavado a lavadores que vão até onde o carro está, como no Uber. Atende quem mora em casa, em prédio ou deixa o carro no estacionamento da empresa.</w:t>
       </w:r>
     </w:p>
     <w:p>
@@ -95,7 +95,7 @@
           <w:sz w:val="22"/>
           <w:szCs w:val="22"/>
         </w:rPr>
-        <w:t>A ideia se apoia em três pontos:</w:t>
+        <w:t>O caminho é sempre o mesmo:</w:t>
       </w:r>
     </w:p>
     <w:p>
@@ -115,22 +115,11 @@
       <w:r>
         <w:rPr>
           <w:rFonts w:ascii="Calibri" w:eastAsia="Times New Roman" w:hAnsi="Calibri" w:cs="Calibri"/>
-          <w:b/>
-          <w:bCs/>
-          <w:color w:val="1A1A1A"/>
-          <w:sz w:val="22"/>
-          <w:szCs w:val="22"/>
-        </w:rPr>
-        <w:t>Sem entregar a chave:</w:t>
-      </w:r>
-      <w:r>
-        <w:rPr>
-          <w:rFonts w:ascii="Calibri" w:eastAsia="Times New Roman" w:hAnsi="Calibri" w:cs="Calibri"/>
-          <w:color w:val="1A1A1A"/>
-          <w:sz w:val="22"/>
-          <w:szCs w:val="22"/>
-        </w:rPr>
-        <w:t xml:space="preserve"> ninguém dirige o carro e não tem manobrista.</w:t>
+          <w:color w:val="1A1A1A"/>
+          <w:sz w:val="22"/>
+          <w:szCs w:val="22"/>
+        </w:rPr>
+        <w:t>O cliente abre o app e escolhe o serviço e o horário.</w:t>
       </w:r>
     </w:p>
     <w:p>
@@ -150,22 +139,11 @@
       <w:r>
         <w:rPr>
           <w:rFonts w:ascii="Calibri" w:eastAsia="Times New Roman" w:hAnsi="Calibri" w:cs="Calibri"/>
-          <w:b/>
-          <w:bCs/>
-          <w:color w:val="1A1A1A"/>
-          <w:sz w:val="22"/>
-          <w:szCs w:val="22"/>
-        </w:rPr>
-        <w:t>Produto do lavador:</w:t>
-      </w:r>
-      <w:r>
-        <w:rPr>
-          <w:rFonts w:ascii="Calibri" w:eastAsia="Times New Roman" w:hAnsi="Calibri" w:cs="Calibri"/>
-          <w:color w:val="1A1A1A"/>
-          <w:sz w:val="22"/>
-          <w:szCs w:val="22"/>
-        </w:rPr>
-        <w:t xml:space="preserve"> ele leva os próprios produtos. Se o cliente quiser fornecer os dele, paga menos.</w:t>
+          <w:color w:val="1A1A1A"/>
+          <w:sz w:val="22"/>
+          <w:szCs w:val="22"/>
+        </w:rPr>
+        <w:t>Vê os lavadores disponíveis, com a ficha de cada um: foto, nota e quantas lavagens já fez.</w:t>
       </w:r>
     </w:p>
     <w:p>
@@ -185,38 +163,35 @@
       <w:r>
         <w:rPr>
           <w:rFonts w:ascii="Calibri" w:eastAsia="Times New Roman" w:hAnsi="Calibri" w:cs="Calibri"/>
-          <w:b/>
-          <w:bCs/>
-          <w:color w:val="1A1A1A"/>
-          <w:sz w:val="22"/>
-          <w:szCs w:val="22"/>
-        </w:rPr>
-        <w:t>Mais fácil e mais barato:</w:t>
-      </w:r>
-      <w:r>
-        <w:rPr>
-          <w:rFonts w:ascii="Calibri" w:eastAsia="Times New Roman" w:hAnsi="Calibri" w:cs="Calibri"/>
-          <w:color w:val="1A1A1A"/>
-          <w:sz w:val="22"/>
-          <w:szCs w:val="22"/>
-        </w:rPr>
-        <w:t xml:space="preserve"> hoje um lava-rápido cobra mais de R$ 100 e às vezes fica com o carro o dia inteiro por causa da fila.</w:t>
+          <w:color w:val="1A1A1A"/>
+          <w:sz w:val="22"/>
+          <w:szCs w:val="22"/>
+        </w:rPr>
+        <w:t>O lavador vai até o carro, lava e tira fotos de antes e depois.</w:t>
       </w:r>
     </w:p>
     <w:p>
       <w:pPr>
-        <w:pStyle w:val="Ttulo2"/>
-        <w:rPr>
-          <w:rFonts w:ascii="Calibri" w:eastAsia="Times New Roman" w:hAnsi="Calibri" w:cs="Calibri"/>
-          <w:color w:val="1A1A1A"/>
-        </w:rPr>
-      </w:pPr>
-      <w:r>
-        <w:rPr>
-          <w:rFonts w:ascii="Calibri" w:eastAsia="Times New Roman" w:hAnsi="Calibri" w:cs="Calibri"/>
-          <w:color w:val="1A1A1A"/>
-        </w:rPr>
-        <w:t>Resumo</w:t>
+        <w:numPr>
+          <w:ilvl w:val="0"/>
+          <w:numId w:val="1"/>
+        </w:numPr>
+        <w:spacing w:before="100" w:beforeAutospacing="1" w:after="80"/>
+        <w:rPr>
+          <w:rFonts w:ascii="Calibri" w:eastAsia="Times New Roman" w:hAnsi="Calibri" w:cs="Calibri"/>
+          <w:color w:val="1A1A1A"/>
+          <w:sz w:val="22"/>
+          <w:szCs w:val="22"/>
+        </w:rPr>
+      </w:pPr>
+      <w:r>
+        <w:rPr>
+          <w:rFonts w:ascii="Calibri" w:eastAsia="Times New Roman" w:hAnsi="Calibri" w:cs="Calibri"/>
+          <w:color w:val="1A1A1A"/>
+          <w:sz w:val="22"/>
+          <w:szCs w:val="22"/>
+        </w:rPr>
+        <w:t>O cliente paga pelo app e avalia o lavador.</w:t>
       </w:r>
     </w:p>
     <w:p>
@@ -236,63 +211,7 @@
           <w:sz w:val="22"/>
           <w:szCs w:val="22"/>
         </w:rPr>
-        <w:t>A dor é real, mas a conta só fecha se o lavador atender vários carros no mesmo lugar. No delivery, o maior custo é o tempo de deslocamento, não o produto.</w:t>
-      </w:r>
-    </w:p>
-    <w:p>
-      <w:pPr>
-        <w:pStyle w:val="NormalWeb"/>
-        <w:rPr>
-          <w:rFonts w:ascii="Calibri" w:hAnsi="Calibri" w:cs="Calibri"/>
-          <w:color w:val="1A1A1A"/>
-          <w:sz w:val="22"/>
-          <w:szCs w:val="22"/>
-        </w:rPr>
-      </w:pPr>
-      <w:r>
-        <w:rPr>
-          <w:rFonts w:ascii="Calibri" w:hAnsi="Calibri" w:cs="Calibri"/>
-          <w:color w:val="1A1A1A"/>
-          <w:sz w:val="22"/>
-          <w:szCs w:val="22"/>
-        </w:rPr>
-        <w:t>O maior risco é o cliente e o lavador passarem a fechar direto, sem o app. O melhor começo é o dia da lavagem em condomínios e estacionamentos de empresa, testado sem app por 4 a 6 semanas.</w:t>
-      </w:r>
-    </w:p>
-    <w:p>
-      <w:pPr>
-        <w:pStyle w:val="Ttulo2"/>
-        <w:rPr>
-          <w:rFonts w:ascii="Calibri" w:eastAsia="Times New Roman" w:hAnsi="Calibri" w:cs="Calibri"/>
-          <w:color w:val="1A1A1A"/>
-        </w:rPr>
-      </w:pPr>
-      <w:r>
-        <w:rPr>
-          <w:rFonts w:ascii="Calibri" w:eastAsia="Times New Roman" w:hAnsi="Calibri" w:cs="Calibri"/>
-          <w:color w:val="1A1A1A"/>
-        </w:rPr>
-        <w:t>Os três pontos da ideia</w:t>
-      </w:r>
-    </w:p>
-    <w:p>
-      <w:pPr>
-        <w:pStyle w:val="NormalWeb"/>
-        <w:rPr>
-          <w:rFonts w:ascii="Calibri" w:hAnsi="Calibri" w:cs="Calibri"/>
-          <w:color w:val="1A1A1A"/>
-          <w:sz w:val="22"/>
-          <w:szCs w:val="22"/>
-        </w:rPr>
-      </w:pPr>
-      <w:r>
-        <w:rPr>
-          <w:rFonts w:ascii="Calibri" w:hAnsi="Calibri" w:cs="Calibri"/>
-          <w:color w:val="1A1A1A"/>
-          <w:sz w:val="22"/>
-          <w:szCs w:val="22"/>
-        </w:rPr>
-        <w:t>Dos três, o primeiro se sustenta, o segundo eu cortaria e o terceiro depende de volume no mesmo lugar.</w:t>
+        <w:t>A ideia se apoia em três pontos:</w:t>
       </w:r>
     </w:p>
     <w:p>
@@ -318,16 +237,16 @@
           <w:sz w:val="22"/>
           <w:szCs w:val="22"/>
         </w:rPr>
-        <w:t>Não entregar a chave.</w:t>
-      </w:r>
-      <w:r>
-        <w:rPr>
-          <w:rFonts w:ascii="Calibri" w:eastAsia="Times New Roman" w:hAnsi="Calibri" w:cs="Calibri"/>
-          <w:color w:val="1A1A1A"/>
-          <w:sz w:val="22"/>
-          <w:szCs w:val="22"/>
-        </w:rPr>
-        <w:t xml:space="preserve"> É um bom argumento de confiança. Mas, pra limpar por dentro, o carro precisa estar aberto: o cliente abre e fecha, ou a lavagem é só externa. Um check-in resolve: o lavador fotografa o carro inteiro e, no fim, o cliente confere as fotos e tranca.</w:t>
+        <w:t>Sem entregar a chave:</w:t>
+      </w:r>
+      <w:r>
+        <w:rPr>
+          <w:rFonts w:ascii="Calibri" w:eastAsia="Times New Roman" w:hAnsi="Calibri" w:cs="Calibri"/>
+          <w:color w:val="1A1A1A"/>
+          <w:sz w:val="22"/>
+          <w:szCs w:val="22"/>
+        </w:rPr>
+        <w:t xml:space="preserve"> ninguém dirige o carro e não tem manobrista.</w:t>
       </w:r>
     </w:p>
     <w:p>
@@ -353,25 +272,16 @@
           <w:sz w:val="22"/>
           <w:szCs w:val="22"/>
         </w:rPr>
-        <w:t>Produto do cliente com desconto.</w:t>
-      </w:r>
-      <w:r>
-        <w:rPr>
-          <w:rFonts w:ascii="Calibri" w:eastAsia="Times New Roman" w:hAnsi="Calibri" w:cs="Calibri"/>
-          <w:color w:val="1A1A1A"/>
-          <w:sz w:val="22"/>
-          <w:szCs w:val="22"/>
-        </w:rPr>
-        <w:t xml:space="preserve"> </w:t>
-      </w:r>
-      <w:r>
-        <w:rPr>
-          <w:rFonts w:ascii="Calibri" w:eastAsia="Times New Roman" w:hAnsi="Calibri" w:cs="Calibri"/>
-          <w:color w:val="1A1A1A"/>
-          <w:sz w:val="22"/>
-          <w:szCs w:val="22"/>
-        </w:rPr>
-        <w:t>Produto profissional diluído custa uns R$ 5 a 10 por lavagem (estimativa), então o desconto seria pequeno. Muita gente usa detergente de cozinha ou sabão em pó, que tiram a cera e mancham a pintura, e aí ninguém sabe de quem é a culpa. Melhor um kit padrão da plataforma, igual pra todo lavador.</w:t>
+        <w:t>Produto do lavador:</w:t>
+      </w:r>
+      <w:r>
+        <w:rPr>
+          <w:rFonts w:ascii="Calibri" w:eastAsia="Times New Roman" w:hAnsi="Calibri" w:cs="Calibri"/>
+          <w:color w:val="1A1A1A"/>
+          <w:sz w:val="22"/>
+          <w:szCs w:val="22"/>
+        </w:rPr>
+        <w:t xml:space="preserve"> ele leva os próprios produtos. Se o cliente quiser fornecer os dele, paga menos.</w:t>
       </w:r>
     </w:p>
     <w:p>
@@ -397,16 +307,16 @@
           <w:sz w:val="22"/>
           <w:szCs w:val="22"/>
         </w:rPr>
-        <w:t>Mais fácil, rápido e barato.</w:t>
-      </w:r>
-      <w:r>
-        <w:rPr>
-          <w:rFonts w:ascii="Calibri" w:eastAsia="Times New Roman" w:hAnsi="Calibri" w:cs="Calibri"/>
-          <w:color w:val="1A1A1A"/>
-          <w:sz w:val="22"/>
-          <w:szCs w:val="22"/>
-        </w:rPr>
-        <w:t xml:space="preserve"> Fácil e rápido, sim: não tem fila e o carro nem sai da vaga. Mais barato, só se o lavador atender vários carros no mesmo lugar.</w:t>
+        <w:t>Mais fácil e mais barato:</w:t>
+      </w:r>
+      <w:r>
+        <w:rPr>
+          <w:rFonts w:ascii="Calibri" w:eastAsia="Times New Roman" w:hAnsi="Calibri" w:cs="Calibri"/>
+          <w:color w:val="1A1A1A"/>
+          <w:sz w:val="22"/>
+          <w:szCs w:val="22"/>
+        </w:rPr>
+        <w:t xml:space="preserve"> hoje um lava-rápido cobra mais de R$ 100 e às vezes fica com o carro o dia inteiro por causa da fila.</w:t>
       </w:r>
     </w:p>
     <w:p>
@@ -422,7 +332,7 @@
           <w:rFonts w:ascii="Calibri" w:eastAsia="Times New Roman" w:hAnsi="Calibri" w:cs="Calibri"/>
           <w:color w:val="1A1A1A"/>
         </w:rPr>
-        <w:t>A conta: avulso x dia do condomínio</w:t>
+        <w:t>Resumo</w:t>
       </w:r>
     </w:p>
     <w:p>
@@ -442,7 +352,234 @@
           <w:sz w:val="22"/>
           <w:szCs w:val="22"/>
         </w:rPr>
-        <w:t>Com números de exemplo, o lavador tira cerca de R$ 4.700 por mês no condomínio, contra R$ 3.400 no avulso, e o cliente ainda paga R$ 10 a menos.</w:t>
+        <w:t>A dor é real, mas a conta só fecha se o lavador atender vários carros perto um do outro. No delivery, o maior custo é o tempo de deslocamento, não o produto.</w:t>
+      </w:r>
+    </w:p>
+    <w:p>
+      <w:pPr>
+        <w:pStyle w:val="NormalWeb"/>
+        <w:rPr>
+          <w:rFonts w:ascii="Calibri" w:hAnsi="Calibri" w:cs="Calibri"/>
+          <w:color w:val="1A1A1A"/>
+          <w:sz w:val="22"/>
+          <w:szCs w:val="22"/>
+        </w:rPr>
+      </w:pPr>
+      <w:r>
+        <w:rPr>
+          <w:rFonts w:ascii="Calibri" w:hAnsi="Calibri" w:cs="Calibri"/>
+          <w:color w:val="1A1A1A"/>
+          <w:sz w:val="22"/>
+          <w:szCs w:val="22"/>
+        </w:rPr>
+        <w:t>Por isso o app junta os pedidos: rota por bairro pras casas e dia da lavagem em prédios e empresas. O maior risco é o cliente e o lavador passarem a fechar direto, sem o app.</w:t>
+      </w:r>
+    </w:p>
+    <w:p>
+      <w:pPr>
+        <w:pStyle w:val="NormalWeb"/>
+        <w:rPr>
+          <w:rFonts w:ascii="Calibri" w:hAnsi="Calibri" w:cs="Calibri"/>
+          <w:color w:val="1A1A1A"/>
+          <w:sz w:val="22"/>
+          <w:szCs w:val="22"/>
+        </w:rPr>
+      </w:pPr>
+      <w:r>
+        <w:rPr>
+          <w:rFonts w:ascii="Calibri" w:hAnsi="Calibri" w:cs="Calibri"/>
+          <w:color w:val="1A1A1A"/>
+          <w:sz w:val="22"/>
+          <w:szCs w:val="22"/>
+        </w:rPr>
+        <w:t>Antes de programar o app, vale um piloto de 4 a 6 semanas pelo WhatsApp, num bairro de casas e em 2 ou 3 prédios.</w:t>
+      </w:r>
+    </w:p>
+    <w:p>
+      <w:pPr>
+        <w:pStyle w:val="Ttulo2"/>
+        <w:rPr>
+          <w:rFonts w:ascii="Calibri" w:eastAsia="Times New Roman" w:hAnsi="Calibri" w:cs="Calibri"/>
+          <w:color w:val="1A1A1A"/>
+        </w:rPr>
+      </w:pPr>
+      <w:r>
+        <w:rPr>
+          <w:rFonts w:ascii="Calibri" w:eastAsia="Times New Roman" w:hAnsi="Calibri" w:cs="Calibri"/>
+          <w:color w:val="1A1A1A"/>
+        </w:rPr>
+        <w:t>Os três pontos da ideia</w:t>
+      </w:r>
+    </w:p>
+    <w:p>
+      <w:pPr>
+        <w:pStyle w:val="NormalWeb"/>
+        <w:rPr>
+          <w:rFonts w:ascii="Calibri" w:hAnsi="Calibri" w:cs="Calibri"/>
+          <w:color w:val="1A1A1A"/>
+          <w:sz w:val="22"/>
+          <w:szCs w:val="22"/>
+        </w:rPr>
+      </w:pPr>
+      <w:r>
+        <w:rPr>
+          <w:rFonts w:ascii="Calibri" w:hAnsi="Calibri" w:cs="Calibri"/>
+          <w:color w:val="1A1A1A"/>
+          <w:sz w:val="22"/>
+          <w:szCs w:val="22"/>
+        </w:rPr>
+        <w:t>Dos três, o primeiro se sustenta, o segundo eu cortaria e o terceiro depende de juntar pedidos próximos.</w:t>
+      </w:r>
+    </w:p>
+    <w:p>
+      <w:pPr>
+        <w:numPr>
+          <w:ilvl w:val="0"/>
+          <w:numId w:val="3"/>
+        </w:numPr>
+        <w:spacing w:before="100" w:beforeAutospacing="1" w:after="80"/>
+        <w:rPr>
+          <w:rFonts w:ascii="Calibri" w:eastAsia="Times New Roman" w:hAnsi="Calibri" w:cs="Calibri"/>
+          <w:color w:val="1A1A1A"/>
+          <w:sz w:val="22"/>
+          <w:szCs w:val="22"/>
+        </w:rPr>
+      </w:pPr>
+      <w:r>
+        <w:rPr>
+          <w:rFonts w:ascii="Calibri" w:eastAsia="Times New Roman" w:hAnsi="Calibri" w:cs="Calibri"/>
+          <w:b/>
+          <w:bCs/>
+          <w:color w:val="1A1A1A"/>
+          <w:sz w:val="22"/>
+          <w:szCs w:val="22"/>
+        </w:rPr>
+        <w:t>Não entregar a chave.</w:t>
+      </w:r>
+      <w:r>
+        <w:rPr>
+          <w:rFonts w:ascii="Calibri" w:eastAsia="Times New Roman" w:hAnsi="Calibri" w:cs="Calibri"/>
+          <w:color w:val="1A1A1A"/>
+          <w:sz w:val="22"/>
+          <w:szCs w:val="22"/>
+        </w:rPr>
+        <w:t xml:space="preserve"> É um bom argumento de confiança. Mas, pra limpar por dentro, o carro precisa estar aberto: o cliente abre e fecha, ou a lavagem é só externa. Um check-in resolve: o lavador fotografa o carro inteiro e, no fim, o cliente confere as fotos e tranca.</w:t>
+      </w:r>
+    </w:p>
+    <w:p>
+      <w:pPr>
+        <w:numPr>
+          <w:ilvl w:val="0"/>
+          <w:numId w:val="3"/>
+        </w:numPr>
+        <w:spacing w:before="100" w:beforeAutospacing="1" w:after="80"/>
+        <w:rPr>
+          <w:rFonts w:ascii="Calibri" w:eastAsia="Times New Roman" w:hAnsi="Calibri" w:cs="Calibri"/>
+          <w:color w:val="1A1A1A"/>
+          <w:sz w:val="22"/>
+          <w:szCs w:val="22"/>
+        </w:rPr>
+      </w:pPr>
+      <w:r>
+        <w:rPr>
+          <w:rFonts w:ascii="Calibri" w:eastAsia="Times New Roman" w:hAnsi="Calibri" w:cs="Calibri"/>
+          <w:b/>
+          <w:bCs/>
+          <w:color w:val="1A1A1A"/>
+          <w:sz w:val="22"/>
+          <w:szCs w:val="22"/>
+        </w:rPr>
+        <w:t>Produto do cliente com desconto.</w:t>
+      </w:r>
+      <w:r>
+        <w:rPr>
+          <w:rFonts w:ascii="Calibri" w:eastAsia="Times New Roman" w:hAnsi="Calibri" w:cs="Calibri"/>
+          <w:color w:val="1A1A1A"/>
+          <w:sz w:val="22"/>
+          <w:szCs w:val="22"/>
+        </w:rPr>
+        <w:t xml:space="preserve"> </w:t>
+      </w:r>
+      <w:r>
+        <w:rPr>
+          <w:rFonts w:ascii="Calibri" w:eastAsia="Times New Roman" w:hAnsi="Calibri" w:cs="Calibri"/>
+          <w:color w:val="1A1A1A"/>
+          <w:sz w:val="22"/>
+          <w:szCs w:val="22"/>
+        </w:rPr>
+        <w:t>Produto profissional diluído custa uns R$ 5 a 10 por lavagem (estimativa), então o desconto seria pequeno. Muita gente usa detergente de cozinha ou sabão em pó, que tiram a cera e mancham a pintura, e aí ninguém sabe de quem é a culpa. Melhor um kit padrão da plataforma, igual pra todo lavador.</w:t>
+      </w:r>
+    </w:p>
+    <w:p>
+      <w:pPr>
+        <w:numPr>
+          <w:ilvl w:val="0"/>
+          <w:numId w:val="3"/>
+        </w:numPr>
+        <w:spacing w:before="100" w:beforeAutospacing="1" w:after="80"/>
+        <w:rPr>
+          <w:rFonts w:ascii="Calibri" w:eastAsia="Times New Roman" w:hAnsi="Calibri" w:cs="Calibri"/>
+          <w:color w:val="1A1A1A"/>
+          <w:sz w:val="22"/>
+          <w:szCs w:val="22"/>
+        </w:rPr>
+      </w:pPr>
+      <w:r>
+        <w:rPr>
+          <w:rFonts w:ascii="Calibri" w:eastAsia="Times New Roman" w:hAnsi="Calibri" w:cs="Calibri"/>
+          <w:b/>
+          <w:bCs/>
+          <w:color w:val="1A1A1A"/>
+          <w:sz w:val="22"/>
+          <w:szCs w:val="22"/>
+        </w:rPr>
+        <w:lastRenderedPageBreak/>
+        <w:t>Mais fácil, rápido e barato.</w:t>
+      </w:r>
+      <w:r>
+        <w:rPr>
+          <w:rFonts w:ascii="Calibri" w:eastAsia="Times New Roman" w:hAnsi="Calibri" w:cs="Calibri"/>
+          <w:color w:val="1A1A1A"/>
+          <w:sz w:val="22"/>
+          <w:szCs w:val="22"/>
+        </w:rPr>
+        <w:t xml:space="preserve"> Fácil e rápido, sim: não tem fila e o carro nem sai da vaga. Mais barato, só se o lavador atender vários carros perto um do outro: no mesmo prédio ou na mesma rota do bairro.</w:t>
+      </w:r>
+    </w:p>
+    <w:p>
+      <w:pPr>
+        <w:pStyle w:val="Ttulo2"/>
+        <w:rPr>
+          <w:rFonts w:ascii="Calibri" w:eastAsia="Times New Roman" w:hAnsi="Calibri" w:cs="Calibri"/>
+          <w:color w:val="1A1A1A"/>
+        </w:rPr>
+      </w:pPr>
+      <w:r>
+        <w:rPr>
+          <w:rFonts w:ascii="Calibri" w:eastAsia="Times New Roman" w:hAnsi="Calibri" w:cs="Calibri"/>
+          <w:color w:val="1A1A1A"/>
+        </w:rPr>
+        <w:t>A conta: avulso, rota no bairro e condomínio</w:t>
+      </w:r>
+    </w:p>
+    <w:p>
+      <w:pPr>
+        <w:pStyle w:val="NormalWeb"/>
+        <w:rPr>
+          <w:rFonts w:ascii="Calibri" w:hAnsi="Calibri" w:cs="Calibri"/>
+          <w:color w:val="1A1A1A"/>
+          <w:sz w:val="22"/>
+          <w:szCs w:val="22"/>
+        </w:rPr>
+      </w:pPr>
+      <w:r>
+        <w:rPr>
+          <w:rFonts w:ascii="Calibri" w:hAnsi="Calibri" w:cs="Calibri"/>
+          <w:color w:val="1A1A1A"/>
+          <w:sz w:val="22"/>
+          <w:szCs w:val="22"/>
+        </w:rPr>
+        <w:t>Com números de exemplo, juntar pedidos faz o lavador passar de R$ 3.400 por mês no avulso pra R$ 4.200 na rota do bairro e R$ 4.700 no condomínio, com o cliente pagando menos.</w:t>
       </w:r>
     </w:p>
     <w:tbl>
@@ -457,9 +594,10 @@
         <w:tblLook w:val="04A0" w:firstRow="1" w:lastRow="0" w:firstColumn="1" w:lastColumn="0" w:noHBand="0" w:noVBand="1"/>
       </w:tblPr>
       <w:tblGrid>
-        <w:gridCol w:w="3011"/>
-        <w:gridCol w:w="2142"/>
-        <w:gridCol w:w="3335"/>
+        <w:gridCol w:w="2418"/>
+        <w:gridCol w:w="1684"/>
+        <w:gridCol w:w="1830"/>
+        <w:gridCol w:w="2556"/>
       </w:tblGrid>
       <w:tr>
         <w:tc>
@@ -587,6 +725,49 @@
                 <w:sz w:val="20"/>
                 <w:szCs w:val="20"/>
               </w:rPr>
+              <w:t>Rota no bairro (casas vizinhas)</w:t>
+            </w:r>
+          </w:p>
+        </w:tc>
+        <w:tc>
+          <w:tcPr>
+            <w:tcW w:w="0" w:type="auto"/>
+            <w:tcBorders>
+              <w:top w:val="single" w:sz="6" w:space="0" w:color="B6C2CC"/>
+              <w:left w:val="single" w:sz="6" w:space="0" w:color="B6C2CC"/>
+              <w:bottom w:val="single" w:sz="6" w:space="0" w:color="B6C2CC"/>
+              <w:right w:val="single" w:sz="6" w:space="0" w:color="B6C2CC"/>
+            </w:tcBorders>
+            <w:shd w:val="clear" w:color="auto" w:fill="EDF1F4"/>
+            <w:tcMar>
+              <w:top w:w="80" w:type="dxa"/>
+              <w:left w:w="120" w:type="dxa"/>
+              <w:bottom w:w="80" w:type="dxa"/>
+              <w:right w:w="120" w:type="dxa"/>
+            </w:tcMar>
+            <w:hideMark/>
+          </w:tcPr>
+          <w:p>
+            <w:pPr>
+              <w:spacing w:after="160"/>
+              <w:rPr>
+                <w:rFonts w:ascii="Calibri" w:eastAsia="Times New Roman" w:hAnsi="Calibri" w:cs="Calibri"/>
+                <w:b/>
+                <w:bCs/>
+                <w:color w:val="1A1A1A"/>
+                <w:sz w:val="20"/>
+                <w:szCs w:val="20"/>
+              </w:rPr>
+            </w:pPr>
+            <w:r>
+              <w:rPr>
+                <w:rFonts w:ascii="Calibri" w:eastAsia="Times New Roman" w:hAnsi="Calibri" w:cs="Calibri"/>
+                <w:b/>
+                <w:bCs/>
+                <w:color w:val="1A1A1A"/>
+                <w:sz w:val="20"/>
+                <w:szCs w:val="20"/>
+              </w:rPr>
               <w:t>Dia do condomínio (vários no mesmo prédio)</w:t>
             </w:r>
           </w:p>
@@ -627,7 +808,6 @@
                 <w:sz w:val="20"/>
                 <w:szCs w:val="20"/>
               </w:rPr>
-              <w:lastRenderedPageBreak/>
               <w:t>Carros por dia</w:t>
             </w:r>
           </w:p>
@@ -668,6 +848,45 @@
                 <w:szCs w:val="20"/>
               </w:rPr>
               <w:t>4</w:t>
+            </w:r>
+          </w:p>
+        </w:tc>
+        <w:tc>
+          <w:tcPr>
+            <w:tcW w:w="0" w:type="auto"/>
+            <w:tcBorders>
+              <w:top w:val="single" w:sz="6" w:space="0" w:color="B6C2CC"/>
+              <w:left w:val="single" w:sz="6" w:space="0" w:color="B6C2CC"/>
+              <w:bottom w:val="single" w:sz="6" w:space="0" w:color="B6C2CC"/>
+              <w:right w:val="single" w:sz="6" w:space="0" w:color="B6C2CC"/>
+            </w:tcBorders>
+            <w:tcMar>
+              <w:top w:w="80" w:type="dxa"/>
+              <w:left w:w="120" w:type="dxa"/>
+              <w:bottom w:w="80" w:type="dxa"/>
+              <w:right w:w="120" w:type="dxa"/>
+            </w:tcMar>
+            <w:hideMark/>
+          </w:tcPr>
+          <w:p>
+            <w:pPr>
+              <w:spacing w:after="160"/>
+              <w:jc w:val="right"/>
+              <w:rPr>
+                <w:rFonts w:ascii="Calibri" w:eastAsia="Times New Roman" w:hAnsi="Calibri" w:cs="Calibri"/>
+                <w:color w:val="1A1A1A"/>
+                <w:sz w:val="20"/>
+                <w:szCs w:val="20"/>
+              </w:rPr>
+            </w:pPr>
+            <w:r>
+              <w:rPr>
+                <w:rFonts w:ascii="Calibri" w:eastAsia="Times New Roman" w:hAnsi="Calibri" w:cs="Calibri"/>
+                <w:color w:val="1A1A1A"/>
+                <w:sz w:val="20"/>
+                <w:szCs w:val="20"/>
+              </w:rPr>
+              <w:t>5</w:t>
             </w:r>
           </w:p>
         </w:tc>
@@ -824,6 +1043,45 @@
                 <w:sz w:val="20"/>
                 <w:szCs w:val="20"/>
               </w:rPr>
+              <w:t>65</w:t>
+            </w:r>
+          </w:p>
+        </w:tc>
+        <w:tc>
+          <w:tcPr>
+            <w:tcW w:w="0" w:type="auto"/>
+            <w:tcBorders>
+              <w:top w:val="single" w:sz="6" w:space="0" w:color="B6C2CC"/>
+              <w:left w:val="single" w:sz="6" w:space="0" w:color="B6C2CC"/>
+              <w:bottom w:val="single" w:sz="6" w:space="0" w:color="B6C2CC"/>
+              <w:right w:val="single" w:sz="6" w:space="0" w:color="B6C2CC"/>
+            </w:tcBorders>
+            <w:tcMar>
+              <w:top w:w="80" w:type="dxa"/>
+              <w:left w:w="120" w:type="dxa"/>
+              <w:bottom w:w="80" w:type="dxa"/>
+              <w:right w:w="120" w:type="dxa"/>
+            </w:tcMar>
+            <w:hideMark/>
+          </w:tcPr>
+          <w:p>
+            <w:pPr>
+              <w:spacing w:after="160"/>
+              <w:jc w:val="right"/>
+              <w:rPr>
+                <w:rFonts w:ascii="Calibri" w:eastAsia="Times New Roman" w:hAnsi="Calibri" w:cs="Calibri"/>
+                <w:color w:val="1A1A1A"/>
+                <w:sz w:val="20"/>
+                <w:szCs w:val="20"/>
+              </w:rPr>
+            </w:pPr>
+            <w:r>
+              <w:rPr>
+                <w:rFonts w:ascii="Calibri" w:eastAsia="Times New Roman" w:hAnsi="Calibri" w:cs="Calibri"/>
+                <w:color w:val="1A1A1A"/>
+                <w:sz w:val="20"/>
+                <w:szCs w:val="20"/>
+              </w:rPr>
               <w:t>60</w:t>
             </w:r>
           </w:p>
@@ -942,6 +1200,45 @@
                 <w:sz w:val="20"/>
                 <w:szCs w:val="20"/>
               </w:rPr>
+              <w:t>325</w:t>
+            </w:r>
+          </w:p>
+        </w:tc>
+        <w:tc>
+          <w:tcPr>
+            <w:tcW w:w="0" w:type="auto"/>
+            <w:tcBorders>
+              <w:top w:val="single" w:sz="6" w:space="0" w:color="B6C2CC"/>
+              <w:left w:val="single" w:sz="6" w:space="0" w:color="B6C2CC"/>
+              <w:bottom w:val="single" w:sz="6" w:space="0" w:color="B6C2CC"/>
+              <w:right w:val="single" w:sz="6" w:space="0" w:color="B6C2CC"/>
+            </w:tcBorders>
+            <w:tcMar>
+              <w:top w:w="80" w:type="dxa"/>
+              <w:left w:w="120" w:type="dxa"/>
+              <w:bottom w:w="80" w:type="dxa"/>
+              <w:right w:w="120" w:type="dxa"/>
+            </w:tcMar>
+            <w:hideMark/>
+          </w:tcPr>
+          <w:p>
+            <w:pPr>
+              <w:spacing w:after="160"/>
+              <w:jc w:val="right"/>
+              <w:rPr>
+                <w:rFonts w:ascii="Calibri" w:eastAsia="Times New Roman" w:hAnsi="Calibri" w:cs="Calibri"/>
+                <w:color w:val="1A1A1A"/>
+                <w:sz w:val="20"/>
+                <w:szCs w:val="20"/>
+              </w:rPr>
+            </w:pPr>
+            <w:r>
+              <w:rPr>
+                <w:rFonts w:ascii="Calibri" w:eastAsia="Times New Roman" w:hAnsi="Calibri" w:cs="Calibri"/>
+                <w:color w:val="1A1A1A"/>
+                <w:sz w:val="20"/>
+                <w:szCs w:val="20"/>
+              </w:rPr>
               <w:t>360</w:t>
             </w:r>
           </w:p>
@@ -1060,6 +1357,45 @@
                 <w:sz w:val="20"/>
                 <w:szCs w:val="20"/>
               </w:rPr>
+              <w:t>− 65</w:t>
+            </w:r>
+          </w:p>
+        </w:tc>
+        <w:tc>
+          <w:tcPr>
+            <w:tcW w:w="0" w:type="auto"/>
+            <w:tcBorders>
+              <w:top w:val="single" w:sz="6" w:space="0" w:color="B6C2CC"/>
+              <w:left w:val="single" w:sz="6" w:space="0" w:color="B6C2CC"/>
+              <w:bottom w:val="single" w:sz="6" w:space="0" w:color="B6C2CC"/>
+              <w:right w:val="single" w:sz="6" w:space="0" w:color="B6C2CC"/>
+            </w:tcBorders>
+            <w:tcMar>
+              <w:top w:w="80" w:type="dxa"/>
+              <w:left w:w="120" w:type="dxa"/>
+              <w:bottom w:w="80" w:type="dxa"/>
+              <w:right w:w="120" w:type="dxa"/>
+            </w:tcMar>
+            <w:hideMark/>
+          </w:tcPr>
+          <w:p>
+            <w:pPr>
+              <w:spacing w:after="160"/>
+              <w:jc w:val="right"/>
+              <w:rPr>
+                <w:rFonts w:ascii="Calibri" w:eastAsia="Times New Roman" w:hAnsi="Calibri" w:cs="Calibri"/>
+                <w:color w:val="1A1A1A"/>
+                <w:sz w:val="20"/>
+                <w:szCs w:val="20"/>
+              </w:rPr>
+            </w:pPr>
+            <w:r>
+              <w:rPr>
+                <w:rFonts w:ascii="Calibri" w:eastAsia="Times New Roman" w:hAnsi="Calibri" w:cs="Calibri"/>
+                <w:color w:val="1A1A1A"/>
+                <w:sz w:val="20"/>
+                <w:szCs w:val="20"/>
+              </w:rPr>
               <w:t>− 72</w:t>
             </w:r>
           </w:p>
@@ -1178,6 +1514,45 @@
                 <w:sz w:val="20"/>
                 <w:szCs w:val="20"/>
               </w:rPr>
+              <w:t>− 50</w:t>
+            </w:r>
+          </w:p>
+        </w:tc>
+        <w:tc>
+          <w:tcPr>
+            <w:tcW w:w="0" w:type="auto"/>
+            <w:tcBorders>
+              <w:top w:val="single" w:sz="6" w:space="0" w:color="B6C2CC"/>
+              <w:left w:val="single" w:sz="6" w:space="0" w:color="B6C2CC"/>
+              <w:bottom w:val="single" w:sz="6" w:space="0" w:color="B6C2CC"/>
+              <w:right w:val="single" w:sz="6" w:space="0" w:color="B6C2CC"/>
+            </w:tcBorders>
+            <w:tcMar>
+              <w:top w:w="80" w:type="dxa"/>
+              <w:left w:w="120" w:type="dxa"/>
+              <w:bottom w:w="80" w:type="dxa"/>
+              <w:right w:w="120" w:type="dxa"/>
+            </w:tcMar>
+            <w:hideMark/>
+          </w:tcPr>
+          <w:p>
+            <w:pPr>
+              <w:spacing w:after="160"/>
+              <w:jc w:val="right"/>
+              <w:rPr>
+                <w:rFonts w:ascii="Calibri" w:eastAsia="Times New Roman" w:hAnsi="Calibri" w:cs="Calibri"/>
+                <w:color w:val="1A1A1A"/>
+                <w:sz w:val="20"/>
+                <w:szCs w:val="20"/>
+              </w:rPr>
+            </w:pPr>
+            <w:r>
+              <w:rPr>
+                <w:rFonts w:ascii="Calibri" w:eastAsia="Times New Roman" w:hAnsi="Calibri" w:cs="Calibri"/>
+                <w:color w:val="1A1A1A"/>
+                <w:sz w:val="20"/>
+                <w:szCs w:val="20"/>
+              </w:rPr>
               <w:t>− 60</w:t>
             </w:r>
           </w:p>
@@ -1296,6 +1671,45 @@
                 <w:sz w:val="20"/>
                 <w:szCs w:val="20"/>
               </w:rPr>
+              <w:t>− 20</w:t>
+            </w:r>
+          </w:p>
+        </w:tc>
+        <w:tc>
+          <w:tcPr>
+            <w:tcW w:w="0" w:type="auto"/>
+            <w:tcBorders>
+              <w:top w:val="single" w:sz="6" w:space="0" w:color="B6C2CC"/>
+              <w:left w:val="single" w:sz="6" w:space="0" w:color="B6C2CC"/>
+              <w:bottom w:val="single" w:sz="6" w:space="0" w:color="B6C2CC"/>
+              <w:right w:val="single" w:sz="6" w:space="0" w:color="B6C2CC"/>
+            </w:tcBorders>
+            <w:tcMar>
+              <w:top w:w="80" w:type="dxa"/>
+              <w:left w:w="120" w:type="dxa"/>
+              <w:bottom w:w="80" w:type="dxa"/>
+              <w:right w:w="120" w:type="dxa"/>
+            </w:tcMar>
+            <w:hideMark/>
+          </w:tcPr>
+          <w:p>
+            <w:pPr>
+              <w:spacing w:after="160"/>
+              <w:jc w:val="right"/>
+              <w:rPr>
+                <w:rFonts w:ascii="Calibri" w:eastAsia="Times New Roman" w:hAnsi="Calibri" w:cs="Calibri"/>
+                <w:color w:val="1A1A1A"/>
+                <w:sz w:val="20"/>
+                <w:szCs w:val="20"/>
+              </w:rPr>
+            </w:pPr>
+            <w:r>
+              <w:rPr>
+                <w:rFonts w:ascii="Calibri" w:eastAsia="Times New Roman" w:hAnsi="Calibri" w:cs="Calibri"/>
+                <w:color w:val="1A1A1A"/>
+                <w:sz w:val="20"/>
+                <w:szCs w:val="20"/>
+              </w:rPr>
               <w:t>− 15</w:t>
             </w:r>
           </w:p>
@@ -1420,6 +1834,47 @@
                 <w:sz w:val="20"/>
                 <w:szCs w:val="20"/>
               </w:rPr>
+              <w:t>190</w:t>
+            </w:r>
+          </w:p>
+        </w:tc>
+        <w:tc>
+          <w:tcPr>
+            <w:tcW w:w="0" w:type="auto"/>
+            <w:tcBorders>
+              <w:top w:val="single" w:sz="6" w:space="0" w:color="B6C2CC"/>
+              <w:left w:val="single" w:sz="6" w:space="0" w:color="B6C2CC"/>
+              <w:bottom w:val="single" w:sz="6" w:space="0" w:color="B6C2CC"/>
+              <w:right w:val="single" w:sz="6" w:space="0" w:color="B6C2CC"/>
+            </w:tcBorders>
+            <w:tcMar>
+              <w:top w:w="80" w:type="dxa"/>
+              <w:left w:w="120" w:type="dxa"/>
+              <w:bottom w:w="80" w:type="dxa"/>
+              <w:right w:w="120" w:type="dxa"/>
+            </w:tcMar>
+            <w:hideMark/>
+          </w:tcPr>
+          <w:p>
+            <w:pPr>
+              <w:spacing w:after="160"/>
+              <w:jc w:val="right"/>
+              <w:rPr>
+                <w:rFonts w:ascii="Calibri" w:eastAsia="Times New Roman" w:hAnsi="Calibri" w:cs="Calibri"/>
+                <w:color w:val="1A1A1A"/>
+                <w:sz w:val="20"/>
+                <w:szCs w:val="20"/>
+              </w:rPr>
+            </w:pPr>
+            <w:r>
+              <w:rPr>
+                <w:rFonts w:ascii="Calibri" w:eastAsia="Times New Roman" w:hAnsi="Calibri" w:cs="Calibri"/>
+                <w:b/>
+                <w:bCs/>
+                <w:color w:val="1A1A1A"/>
+                <w:sz w:val="20"/>
+                <w:szCs w:val="20"/>
+              </w:rPr>
               <w:t>213</w:t>
             </w:r>
           </w:p>
@@ -1544,6 +1999,47 @@
                 <w:sz w:val="20"/>
                 <w:szCs w:val="20"/>
               </w:rPr>
+              <w:t>~4.200</w:t>
+            </w:r>
+          </w:p>
+        </w:tc>
+        <w:tc>
+          <w:tcPr>
+            <w:tcW w:w="0" w:type="auto"/>
+            <w:tcBorders>
+              <w:top w:val="single" w:sz="6" w:space="0" w:color="B6C2CC"/>
+              <w:left w:val="single" w:sz="6" w:space="0" w:color="B6C2CC"/>
+              <w:bottom w:val="single" w:sz="6" w:space="0" w:color="B6C2CC"/>
+              <w:right w:val="single" w:sz="6" w:space="0" w:color="B6C2CC"/>
+            </w:tcBorders>
+            <w:tcMar>
+              <w:top w:w="80" w:type="dxa"/>
+              <w:left w:w="120" w:type="dxa"/>
+              <w:bottom w:w="80" w:type="dxa"/>
+              <w:right w:w="120" w:type="dxa"/>
+            </w:tcMar>
+            <w:hideMark/>
+          </w:tcPr>
+          <w:p>
+            <w:pPr>
+              <w:spacing w:after="160"/>
+              <w:jc w:val="right"/>
+              <w:rPr>
+                <w:rFonts w:ascii="Calibri" w:eastAsia="Times New Roman" w:hAnsi="Calibri" w:cs="Calibri"/>
+                <w:color w:val="1A1A1A"/>
+                <w:sz w:val="20"/>
+                <w:szCs w:val="20"/>
+              </w:rPr>
+            </w:pPr>
+            <w:r>
+              <w:rPr>
+                <w:rFonts w:ascii="Calibri" w:eastAsia="Times New Roman" w:hAnsi="Calibri" w:cs="Calibri"/>
+                <w:b/>
+                <w:bCs/>
+                <w:color w:val="1A1A1A"/>
+                <w:sz w:val="20"/>
+                <w:szCs w:val="20"/>
+              </w:rPr>
               <w:t>~4.700</w:t>
             </w:r>
           </w:p>
@@ -1624,6 +2120,45 @@
                 <w:szCs w:val="20"/>
               </w:rPr>
               <w:t>1.232</w:t>
+            </w:r>
+          </w:p>
+        </w:tc>
+        <w:tc>
+          <w:tcPr>
+            <w:tcW w:w="0" w:type="auto"/>
+            <w:tcBorders>
+              <w:top w:val="single" w:sz="6" w:space="0" w:color="B6C2CC"/>
+              <w:left w:val="single" w:sz="6" w:space="0" w:color="B6C2CC"/>
+              <w:bottom w:val="single" w:sz="6" w:space="0" w:color="B6C2CC"/>
+              <w:right w:val="single" w:sz="6" w:space="0" w:color="B6C2CC"/>
+            </w:tcBorders>
+            <w:tcMar>
+              <w:top w:w="80" w:type="dxa"/>
+              <w:left w:w="120" w:type="dxa"/>
+              <w:bottom w:w="80" w:type="dxa"/>
+              <w:right w:w="120" w:type="dxa"/>
+            </w:tcMar>
+            <w:hideMark/>
+          </w:tcPr>
+          <w:p>
+            <w:pPr>
+              <w:spacing w:after="160"/>
+              <w:jc w:val="right"/>
+              <w:rPr>
+                <w:rFonts w:ascii="Calibri" w:eastAsia="Times New Roman" w:hAnsi="Calibri" w:cs="Calibri"/>
+                <w:color w:val="1A1A1A"/>
+                <w:sz w:val="20"/>
+                <w:szCs w:val="20"/>
+              </w:rPr>
+            </w:pPr>
+            <w:r>
+              <w:rPr>
+                <w:rFonts w:ascii="Calibri" w:eastAsia="Times New Roman" w:hAnsi="Calibri" w:cs="Calibri"/>
+                <w:color w:val="1A1A1A"/>
+                <w:sz w:val="20"/>
+                <w:szCs w:val="20"/>
+              </w:rPr>
+              <w:t>1.430</w:t>
             </w:r>
           </w:p>
         </w:tc>
@@ -1685,7 +2220,7 @@
           <w:sz w:val="22"/>
           <w:szCs w:val="22"/>
         </w:rPr>
-        <w:t>Os números são chutes pra ilustrar, e o simulador deixa trocar cada um. A conta não inclui MEI, celular, reposição de equipamento nem taxa do cartão.</w:t>
+        <w:t>Os números são chutes pra ilustrar. No simulador, a rota no bairro é o cenário A com 5 carros, R$ 65, R$ 20 de deslocamento e 15 minutos entre um carro e outro. A conta não inclui MEI, celular, reposição de equipamento nem taxa do cartão.</w:t>
       </w:r>
     </w:p>
     <w:p>
@@ -1721,14 +2256,14 @@
           <w:sz w:val="22"/>
           <w:szCs w:val="22"/>
         </w:rPr>
-        <w:t>A mudança principal é trocar o atendimento avulso pelo dia da lavagem em condomínios e empresas.</w:t>
+        <w:t>A mudança principal é juntar pedidos próximos: rota por bairro pras casas e dia da lavagem em prédios e empresas.</w:t>
       </w:r>
     </w:p>
     <w:p>
       <w:pPr>
         <w:numPr>
           <w:ilvl w:val="0"/>
-          <w:numId w:val="3"/>
+          <w:numId w:val="4"/>
         </w:numPr>
         <w:spacing w:before="100" w:beforeAutospacing="1" w:after="80"/>
         <w:rPr>
@@ -1747,7 +2282,7 @@
           <w:sz w:val="22"/>
           <w:szCs w:val="22"/>
         </w:rPr>
-        <w:t>Dia da lavagem no condomínio.</w:t>
+        <w:t>Rota por bairro pras casas.</w:t>
       </w:r>
       <w:r>
         <w:rPr>
@@ -1765,14 +2300,14 @@
           <w:sz w:val="22"/>
           <w:szCs w:val="22"/>
         </w:rPr>
-        <w:t>Um dia fixo por semana combinado com o síndico: os moradores agendam no app e o lavador passa o dia na garagem, lavando de 6 a 10 carros. Isso resolve deslocamento, acesso (o lavador fica cadastrado na portaria) e confiança, porque ele vira "o lavador do prédio". O síndico pode ganhar uma lavagem grátis ou uma parte pro caixa do condomínio. Vale o mesmo pra estacionamento de empresa, como benefício pros funcionários.</w:t>
+        <w:t>O app mostra os dias em que já tem lavador passando no bairro, com preço menor; fora desses dias, o cliente ainda pode pedir, pagando uma taxa de deslocamento. O cliente escolhe manhã ou tarde em vez de um horário exato, e o app monta a rota do lavador. Quem chama um vizinho pro mesmo dia ganha desconto, porque o lavador lava dois carros numa viagem só.</w:t>
       </w:r>
     </w:p>
     <w:p>
       <w:pPr>
         <w:numPr>
           <w:ilvl w:val="0"/>
-          <w:numId w:val="3"/>
+          <w:numId w:val="4"/>
         </w:numPr>
         <w:spacing w:before="100" w:beforeAutospacing="1" w:after="80"/>
         <w:rPr>
@@ -1791,7 +2326,8 @@
           <w:sz w:val="22"/>
           <w:szCs w:val="22"/>
         </w:rPr>
-        <w:t>Assinatura.</w:t>
+        <w:lastRenderedPageBreak/>
+        <w:t>Dia da lavagem em prédios e empresas.</w:t>
       </w:r>
       <w:r>
         <w:rPr>
@@ -1809,14 +2345,14 @@
           <w:sz w:val="22"/>
           <w:szCs w:val="22"/>
         </w:rPr>
-        <w:t>R$ X por mês com 2 ou 4 lavagens: receita previsível, agenda cheia pro lavador e o cliente não precisa lembrar de agendar.</w:t>
+        <w:t>Um dia fixo por semana combinado com o síndico: os moradores agendam no app e o lavador passa o dia na garagem, lavando de 6 a 10 carros. Isso resolve deslocamento, acesso (o lavador fica cadastrado na portaria) e confiança, porque ele vira "o lavador do prédio". O síndico pode ganhar uma lavagem grátis ou uma parte pro caixa do condomínio; no estacionamento de empresa, a lavagem vira benefício pros funcionários.</w:t>
       </w:r>
     </w:p>
     <w:p>
       <w:pPr>
         <w:numPr>
           <w:ilvl w:val="0"/>
-          <w:numId w:val="3"/>
+          <w:numId w:val="4"/>
         </w:numPr>
         <w:spacing w:before="100" w:beforeAutospacing="1" w:after="80"/>
         <w:rPr>
@@ -1835,23 +2371,32 @@
           <w:sz w:val="22"/>
           <w:szCs w:val="22"/>
         </w:rPr>
-        <w:t>Lavagem a seco como padrão.</w:t>
-      </w:r>
-      <w:r>
-        <w:rPr>
-          <w:rFonts w:ascii="Calibri" w:eastAsia="Times New Roman" w:hAnsi="Calibri" w:cs="Calibri"/>
-          <w:color w:val="1A1A1A"/>
-          <w:sz w:val="22"/>
-          <w:szCs w:val="22"/>
-        </w:rPr>
-        <w:t xml:space="preserve"> Produto que limpa sem enxágue, então dá pra lavar na garagem sem molhar nada. O kit cabe numa mochila com um aspirador a bateria, e o lavador vai de moto, bike ou ônibus. Carro com barro precisa de água: recusa ou cobra à parte.</w:t>
+        <w:t>Assinatura.</w:t>
+      </w:r>
+      <w:r>
+        <w:rPr>
+          <w:rFonts w:ascii="Calibri" w:eastAsia="Times New Roman" w:hAnsi="Calibri" w:cs="Calibri"/>
+          <w:color w:val="1A1A1A"/>
+          <w:sz w:val="22"/>
+          <w:szCs w:val="22"/>
+        </w:rPr>
+        <w:t xml:space="preserve"> </w:t>
+      </w:r>
+      <w:r>
+        <w:rPr>
+          <w:rFonts w:ascii="Calibri" w:eastAsia="Times New Roman" w:hAnsi="Calibri" w:cs="Calibri"/>
+          <w:color w:val="1A1A1A"/>
+          <w:sz w:val="22"/>
+          <w:szCs w:val="22"/>
+        </w:rPr>
+        <w:t>R$ X por mês com 2 ou 4 lavagens: receita previsível, agenda cheia pro lavador e o cliente não precisa lembrar de agendar.</w:t>
       </w:r>
     </w:p>
     <w:p>
       <w:pPr>
         <w:numPr>
           <w:ilvl w:val="0"/>
-          <w:numId w:val="3"/>
+          <w:numId w:val="4"/>
         </w:numPr>
         <w:spacing w:before="100" w:beforeAutospacing="1" w:after="80"/>
         <w:rPr>
@@ -1870,32 +2415,23 @@
           <w:sz w:val="22"/>
           <w:szCs w:val="22"/>
         </w:rPr>
-        <w:t>Ficha do lavador e fotos de antes e depois.</w:t>
-      </w:r>
-      <w:r>
-        <w:rPr>
-          <w:rFonts w:ascii="Calibri" w:eastAsia="Times New Roman" w:hAnsi="Calibri" w:cs="Calibri"/>
-          <w:color w:val="1A1A1A"/>
-          <w:sz w:val="22"/>
-          <w:szCs w:val="22"/>
-        </w:rPr>
-        <w:t xml:space="preserve"> </w:t>
-      </w:r>
-      <w:r>
-        <w:rPr>
-          <w:rFonts w:ascii="Calibri" w:eastAsia="Times New Roman" w:hAnsi="Calibri" w:cs="Calibri"/>
-          <w:color w:val="1A1A1A"/>
-          <w:sz w:val="22"/>
-          <w:szCs w:val="22"/>
-        </w:rPr>
-        <w:t>Além de foto e nota: antecedentes checados, número de lavagens e fotos de trabalhos anteriores. As fotos de toda lavagem protegem os dois lados no "esse risco não estava aí".</w:t>
+        <w:t>Lavagem a seco como padrão.</w:t>
+      </w:r>
+      <w:r>
+        <w:rPr>
+          <w:rFonts w:ascii="Calibri" w:eastAsia="Times New Roman" w:hAnsi="Calibri" w:cs="Calibri"/>
+          <w:color w:val="1A1A1A"/>
+          <w:sz w:val="22"/>
+          <w:szCs w:val="22"/>
+        </w:rPr>
+        <w:t xml:space="preserve"> Produto que limpa sem enxágue, então dá pra lavar na garagem sem molhar nada. O kit cabe numa mochila com um aspirador a bateria, e o lavador vai de moto, bike ou ônibus. Carro com barro precisa de água: recusa ou cobra à parte.</w:t>
       </w:r>
     </w:p>
     <w:p>
       <w:pPr>
         <w:numPr>
           <w:ilvl w:val="0"/>
-          <w:numId w:val="3"/>
+          <w:numId w:val="4"/>
         </w:numPr>
         <w:spacing w:before="100" w:beforeAutospacing="1" w:after="80"/>
         <w:rPr>
@@ -1914,23 +2450,32 @@
           <w:sz w:val="22"/>
           <w:szCs w:val="22"/>
         </w:rPr>
-        <w:t>Serviços extras.</w:t>
-      </w:r>
-      <w:r>
-        <w:rPr>
-          <w:rFonts w:ascii="Calibri" w:eastAsia="Times New Roman" w:hAnsi="Calibri" w:cs="Calibri"/>
-          <w:color w:val="1A1A1A"/>
-          <w:sz w:val="22"/>
-          <w:szCs w:val="22"/>
-        </w:rPr>
-        <w:t xml:space="preserve"> Higienização de bancos, cera e polimento de farol rendem bem mais por serviço que a lavagem simples.</w:t>
+        <w:t>Ficha do lavador e fotos de antes e depois.</w:t>
+      </w:r>
+      <w:r>
+        <w:rPr>
+          <w:rFonts w:ascii="Calibri" w:eastAsia="Times New Roman" w:hAnsi="Calibri" w:cs="Calibri"/>
+          <w:color w:val="1A1A1A"/>
+          <w:sz w:val="22"/>
+          <w:szCs w:val="22"/>
+        </w:rPr>
+        <w:t xml:space="preserve"> </w:t>
+      </w:r>
+      <w:r>
+        <w:rPr>
+          <w:rFonts w:ascii="Calibri" w:eastAsia="Times New Roman" w:hAnsi="Calibri" w:cs="Calibri"/>
+          <w:color w:val="1A1A1A"/>
+          <w:sz w:val="22"/>
+          <w:szCs w:val="22"/>
+        </w:rPr>
+        <w:t>Além de foto e nota: antecedentes checados, número de lavagens e fotos de trabalhos anteriores. As fotos de toda lavagem protegem os dois lados no "esse risco não estava aí".</w:t>
       </w:r>
     </w:p>
     <w:p>
       <w:pPr>
         <w:numPr>
           <w:ilvl w:val="0"/>
-          <w:numId w:val="3"/>
+          <w:numId w:val="4"/>
         </w:numPr>
         <w:spacing w:before="100" w:beforeAutospacing="1" w:after="80"/>
         <w:rPr>
@@ -1949,20 +2494,55 @@
           <w:sz w:val="22"/>
           <w:szCs w:val="22"/>
         </w:rPr>
-        <w:t>Empresas, mais pra frente.</w:t>
-      </w:r>
-      <w:r>
-        <w:rPr>
-          <w:rFonts w:ascii="Calibri" w:eastAsia="Times New Roman" w:hAnsi="Calibri" w:cs="Calibri"/>
-          <w:color w:val="1A1A1A"/>
-          <w:sz w:val="22"/>
-          <w:szCs w:val="22"/>
-        </w:rPr>
-        <w:t xml:space="preserve"> Motoristas de aplicativo, frotas, locadoras e lojas de seminovos. A Spiffy, nos EUA, hoje vende serviço móvel pra concessionárias, e frotas estão entre os clientes.</w:t>
+        <w:t>Serviços extras.</w:t>
+      </w:r>
+      <w:r>
+        <w:rPr>
+          <w:rFonts w:ascii="Calibri" w:eastAsia="Times New Roman" w:hAnsi="Calibri" w:cs="Calibri"/>
+          <w:color w:val="1A1A1A"/>
+          <w:sz w:val="22"/>
+          <w:szCs w:val="22"/>
+        </w:rPr>
+        <w:t xml:space="preserve"> Higienização de bancos, cera e polimento de farol rendem bem mais por serviço que a lavagem simples.</w:t>
       </w:r>
     </w:p>
     <w:p>
       <w:pPr>
+        <w:numPr>
+          <w:ilvl w:val="0"/>
+          <w:numId w:val="4"/>
+        </w:numPr>
+        <w:spacing w:before="100" w:beforeAutospacing="1" w:after="80"/>
+        <w:rPr>
+          <w:rFonts w:ascii="Calibri" w:eastAsia="Times New Roman" w:hAnsi="Calibri" w:cs="Calibri"/>
+          <w:color w:val="1A1A1A"/>
+          <w:sz w:val="22"/>
+          <w:szCs w:val="22"/>
+        </w:rPr>
+      </w:pPr>
+      <w:r>
+        <w:rPr>
+          <w:rFonts w:ascii="Calibri" w:eastAsia="Times New Roman" w:hAnsi="Calibri" w:cs="Calibri"/>
+          <w:b/>
+          <w:bCs/>
+          <w:color w:val="1A1A1A"/>
+          <w:sz w:val="22"/>
+          <w:szCs w:val="22"/>
+        </w:rPr>
+        <w:t>Frotas e revendas, mais pra frente.</w:t>
+      </w:r>
+      <w:r>
+        <w:rPr>
+          <w:rFonts w:ascii="Calibri" w:eastAsia="Times New Roman" w:hAnsi="Calibri" w:cs="Calibri"/>
+          <w:color w:val="1A1A1A"/>
+          <w:sz w:val="22"/>
+          <w:szCs w:val="22"/>
+        </w:rPr>
+        <w:t xml:space="preserve"> Motoristas de aplicativo, frotas, locadoras e lojas de seminovos. A Spiffy, nos EUA, hoje vende serviço móvel pra concessionárias, e frotas estão entre os clientes.</w:t>
+      </w:r>
+    </w:p>
+    <w:p>
+      <w:pPr>
         <w:pStyle w:val="Ttulo2"/>
         <w:rPr>
           <w:rFonts w:ascii="Calibri" w:eastAsia="Times New Roman" w:hAnsi="Calibri" w:cs="Calibri"/>
@@ -1974,7 +2554,6 @@
           <w:rFonts w:ascii="Calibri" w:eastAsia="Times New Roman" w:hAnsi="Calibri" w:cs="Calibri"/>
           <w:color w:val="1A1A1A"/>
         </w:rPr>
-        <w:lastRenderedPageBreak/>
         <w:t>Problemas e riscos</w:t>
       </w:r>
     </w:p>
@@ -2392,7 +2971,7 @@
                 <w:sz w:val="20"/>
                 <w:szCs w:val="20"/>
               </w:rPr>
-              <w:t>Lavagem a seco, aspirador a bateria e acordo com o condomínio. Checar a regra da cidade.</w:t>
+              <w:t>Lavagem a seco, aspirador a bateria e acordo com o condomínio; em casa, a garagem ou a frente da casa, com a permissão do dono. Checar a regra da cidade.</w:t>
             </w:r>
           </w:p>
         </w:tc>
@@ -3921,7 +4500,7 @@
           <w:rFonts w:ascii="Calibri" w:eastAsia="Times New Roman" w:hAnsi="Calibri" w:cs="Calibri"/>
           <w:color w:val="1A1A1A"/>
         </w:rPr>
-        <w:t>Como começar sem app</w:t>
+        <w:t>Como testar antes de programar o app</w:t>
       </w:r>
     </w:p>
     <w:p>
@@ -3941,14 +4520,14 @@
           <w:sz w:val="22"/>
           <w:szCs w:val="22"/>
         </w:rPr>
-        <w:t>O primeiro passo é um piloto de 4 a 6 semanas em 2 ou 3 condomínios, ainda sem app.</w:t>
+        <w:t>O primeiro passo é um piloto de 4 a 6 semanas pelo WhatsApp, num bairro de casas e em 2 ou 3 prédios.</w:t>
       </w:r>
     </w:p>
     <w:p>
       <w:pPr>
         <w:numPr>
           <w:ilvl w:val="0"/>
-          <w:numId w:val="4"/>
+          <w:numId w:val="5"/>
         </w:numPr>
         <w:spacing w:before="100" w:beforeAutospacing="1" w:after="80"/>
         <w:rPr>
@@ -3965,14 +4544,14 @@
           <w:sz w:val="22"/>
           <w:szCs w:val="22"/>
         </w:rPr>
-        <w:t>Conversar com uns 10 síndicos e 10 lavadores autônomos.</w:t>
+        <w:t>Conversar com uns 10 síndicos, 10 moradores de casa e 10 lavadores autônomos.</w:t>
       </w:r>
     </w:p>
     <w:p>
       <w:pPr>
         <w:numPr>
           <w:ilvl w:val="0"/>
-          <w:numId w:val="4"/>
+          <w:numId w:val="5"/>
         </w:numPr>
         <w:spacing w:before="100" w:beforeAutospacing="1" w:after="80"/>
         <w:rPr>
@@ -3996,7 +4575,7 @@
       <w:pPr>
         <w:numPr>
           <w:ilvl w:val="0"/>
-          <w:numId w:val="4"/>
+          <w:numId w:val="5"/>
         </w:numPr>
         <w:spacing w:before="100" w:beforeAutospacing="1" w:after="80"/>
         <w:rPr>
@@ -4013,14 +4592,14 @@
           <w:sz w:val="22"/>
           <w:szCs w:val="22"/>
         </w:rPr>
-        <w:t>Medir quantos moradores agendam, quantos voltam a agendar, quantos carros cada lavador faz por dia e quantos tentam fechar por fora.</w:t>
+        <w:t>Medir quantos clientes agendam, quantos voltam a agendar, quantos carros cada lavador faz por dia e quantos tentam fechar por fora.</w:t>
       </w:r>
     </w:p>
     <w:p>
       <w:pPr>
         <w:numPr>
           <w:ilvl w:val="0"/>
-          <w:numId w:val="4"/>
+          <w:numId w:val="5"/>
         </w:numPr>
         <w:spacing w:before="100" w:beforeAutospacing="1" w:after="80"/>
         <w:rPr>
@@ -4037,7 +4616,7 @@
           <w:sz w:val="22"/>
           <w:szCs w:val="22"/>
         </w:rPr>
-        <w:t>Se muita gente voltar a agendar, aí sim fazer o app.</w:t>
+        <w:t>Se muita gente voltar a agendar, aí sim programar o app.</w:t>
       </w:r>
     </w:p>
     <w:p>
@@ -4113,158 +4692,16 @@
           <w:sz w:val="22"/>
           <w:szCs w:val="22"/>
         </w:rPr>
-        <w:t xml:space="preserve"> mostra, a cada mudança, quanto sobra pro lavador e pra plataforma nos dois cenários. Uma cópia fica nesta pasta, no arquivo simulador-de-custos.html, e abre em qualquer navegador.</w:t>
-      </w:r>
-    </w:p>
-    <w:p>
-      <w:pPr>
-        <w:numPr>
-          <w:ilvl w:val="0"/>
-          <w:numId w:val="5"/>
-        </w:numPr>
-        <w:spacing w:before="100" w:beforeAutospacing="1" w:after="80"/>
-        <w:rPr>
-          <w:rFonts w:ascii="Calibri" w:eastAsia="Times New Roman" w:hAnsi="Calibri" w:cs="Calibri"/>
-          <w:color w:val="1A1A1A"/>
-          <w:sz w:val="22"/>
-          <w:szCs w:val="22"/>
-        </w:rPr>
-      </w:pPr>
-      <w:r>
-        <w:rPr>
-          <w:rFonts w:ascii="Calibri" w:eastAsia="Times New Roman" w:hAnsi="Calibri" w:cs="Calibri"/>
-          <w:b/>
-          <w:bCs/>
-          <w:color w:val="1A1A1A"/>
-          <w:sz w:val="22"/>
-          <w:szCs w:val="22"/>
-        </w:rPr>
-        <w:t>Vale pros dois cenários:</w:t>
-      </w:r>
-      <w:r>
-        <w:rPr>
-          <w:rFonts w:ascii="Calibri" w:eastAsia="Times New Roman" w:hAnsi="Calibri" w:cs="Calibri"/>
-          <w:color w:val="1A1A1A"/>
-          <w:sz w:val="22"/>
-          <w:szCs w:val="22"/>
-        </w:rPr>
-        <w:t xml:space="preserve"> comissão da plataforma, produto por carro, tempo de cada lavagem, dias de trabalho no mês e meta de ganho do lavador.</w:t>
-      </w:r>
-    </w:p>
-    <w:p>
-      <w:pPr>
-        <w:numPr>
-          <w:ilvl w:val="0"/>
-          <w:numId w:val="5"/>
-        </w:numPr>
-        <w:spacing w:before="100" w:beforeAutospacing="1" w:after="80"/>
-        <w:rPr>
-          <w:rFonts w:ascii="Calibri" w:eastAsia="Times New Roman" w:hAnsi="Calibri" w:cs="Calibri"/>
-          <w:color w:val="1A1A1A"/>
-          <w:sz w:val="22"/>
-          <w:szCs w:val="22"/>
-        </w:rPr>
-      </w:pPr>
-      <w:r>
-        <w:rPr>
-          <w:rFonts w:ascii="Calibri" w:eastAsia="Times New Roman" w:hAnsi="Calibri" w:cs="Calibri"/>
-          <w:b/>
-          <w:bCs/>
-          <w:color w:val="1A1A1A"/>
-          <w:sz w:val="22"/>
-          <w:szCs w:val="22"/>
-        </w:rPr>
-        <w:t>Muda por cenário:</w:t>
-      </w:r>
-      <w:r>
-        <w:rPr>
-          <w:rFonts w:ascii="Calibri" w:eastAsia="Times New Roman" w:hAnsi="Calibri" w:cs="Calibri"/>
-          <w:color w:val="1A1A1A"/>
-          <w:sz w:val="22"/>
-          <w:szCs w:val="22"/>
-        </w:rPr>
         <w:t xml:space="preserve"> </w:t>
       </w:r>
       <w:r>
         <w:rPr>
-          <w:rFonts w:ascii="Calibri" w:eastAsia="Times New Roman" w:hAnsi="Calibri" w:cs="Calibri"/>
-          <w:color w:val="1A1A1A"/>
-          <w:sz w:val="22"/>
-          <w:szCs w:val="22"/>
-        </w:rPr>
-        <w:t>preço da lavagem, carros por dia, gasto e tempo de deslocamento.</w:t>
-      </w:r>
-    </w:p>
-    <w:p>
-      <w:pPr>
-        <w:numPr>
-          <w:ilvl w:val="0"/>
-          <w:numId w:val="5"/>
-        </w:numPr>
-        <w:spacing w:before="100" w:beforeAutospacing="1" w:after="80"/>
-        <w:rPr>
-          <w:rFonts w:ascii="Calibri" w:eastAsia="Times New Roman" w:hAnsi="Calibri" w:cs="Calibri"/>
-          <w:color w:val="1A1A1A"/>
-          <w:sz w:val="22"/>
-          <w:szCs w:val="22"/>
-        </w:rPr>
-      </w:pPr>
-      <w:r>
-        <w:rPr>
-          <w:rFonts w:ascii="Calibri" w:eastAsia="Times New Roman" w:hAnsi="Calibri" w:cs="Calibri"/>
-          <w:b/>
-          <w:bCs/>
-          <w:color w:val="1A1A1A"/>
-          <w:sz w:val="22"/>
-          <w:szCs w:val="22"/>
-        </w:rPr>
-        <w:t>Plataforma:</w:t>
-      </w:r>
-      <w:r>
-        <w:rPr>
-          <w:rFonts w:ascii="Calibri" w:eastAsia="Times New Roman" w:hAnsi="Calibri" w:cs="Calibri"/>
-          <w:color w:val="1A1A1A"/>
-          <w:sz w:val="22"/>
-          <w:szCs w:val="22"/>
-        </w:rPr>
-        <w:t xml:space="preserve"> quantos lavadores ativos.</w:t>
-      </w:r>
-    </w:p>
-    <w:p>
-      <w:pPr>
-        <w:pStyle w:val="NormalWeb"/>
-        <w:rPr>
           <w:rFonts w:ascii="Calibri" w:hAnsi="Calibri" w:cs="Calibri"/>
           <w:color w:val="1A1A1A"/>
           <w:sz w:val="22"/>
           <w:szCs w:val="22"/>
         </w:rPr>
-      </w:pPr>
-      <w:r>
-        <w:rPr>
-          <w:rFonts w:ascii="Calibri" w:hAnsi="Calibri" w:cs="Calibri"/>
-          <w:color w:val="1A1A1A"/>
-          <w:sz w:val="22"/>
-          <w:szCs w:val="22"/>
-        </w:rPr>
-        <w:t>Ele mostra o ganho do lavador por mês, por dia e por hora, se a jornada cabe no dia, o preço mínimo pra bater a meta, a comanda de cada lavagem e o faturamento da plataforma. Começa com os números da tabela acima e guarda o que você mudar no seu navegador.</w:t>
-      </w:r>
-    </w:p>
-    <w:p>
-      <w:pPr>
-        <w:pStyle w:val="Ttulo2"/>
-        <w:rPr>
-          <w:rFonts w:ascii="Calibri" w:eastAsia="Times New Roman" w:hAnsi="Calibri" w:cs="Calibri"/>
-          <w:color w:val="1A1A1A"/>
-        </w:rPr>
-      </w:pPr>
-      <w:r>
-        <w:rPr>
-          <w:rFonts w:ascii="Calibri" w:eastAsia="Times New Roman" w:hAnsi="Calibri" w:cs="Calibri"/>
-          <w:color w:val="1A1A1A"/>
-        </w:rPr>
-        <w:lastRenderedPageBreak/>
-        <w:t>Fontes</w:t>
+        <w:t>mostra, a cada mudança, quanto sobra pro lavador e pra plataforma nos dois cenários. Uma cópia fica nesta pasta, no arquivo simulador-de-custos.html, e abre em qualquer navegador.</w:t>
       </w:r>
     </w:p>
     <w:p>
@@ -4272,6 +4709,147 @@
         <w:numPr>
           <w:ilvl w:val="0"/>
           <w:numId w:val="6"/>
+        </w:numPr>
+        <w:spacing w:before="100" w:beforeAutospacing="1" w:after="80"/>
+        <w:rPr>
+          <w:rFonts w:ascii="Calibri" w:eastAsia="Times New Roman" w:hAnsi="Calibri" w:cs="Calibri"/>
+          <w:color w:val="1A1A1A"/>
+          <w:sz w:val="22"/>
+          <w:szCs w:val="22"/>
+        </w:rPr>
+      </w:pPr>
+      <w:r>
+        <w:rPr>
+          <w:rFonts w:ascii="Calibri" w:eastAsia="Times New Roman" w:hAnsi="Calibri" w:cs="Calibri"/>
+          <w:b/>
+          <w:bCs/>
+          <w:color w:val="1A1A1A"/>
+          <w:sz w:val="22"/>
+          <w:szCs w:val="22"/>
+        </w:rPr>
+        <w:t>Vale pros dois cenários:</w:t>
+      </w:r>
+      <w:r>
+        <w:rPr>
+          <w:rFonts w:ascii="Calibri" w:eastAsia="Times New Roman" w:hAnsi="Calibri" w:cs="Calibri"/>
+          <w:color w:val="1A1A1A"/>
+          <w:sz w:val="22"/>
+          <w:szCs w:val="22"/>
+        </w:rPr>
+        <w:t xml:space="preserve"> comissão da plataforma, produto por carro, tempo de cada lavagem, dias de trabalho no mês e meta de ganho do lavador.</w:t>
+      </w:r>
+    </w:p>
+    <w:p>
+      <w:pPr>
+        <w:numPr>
+          <w:ilvl w:val="0"/>
+          <w:numId w:val="6"/>
+        </w:numPr>
+        <w:spacing w:before="100" w:beforeAutospacing="1" w:after="80"/>
+        <w:rPr>
+          <w:rFonts w:ascii="Calibri" w:eastAsia="Times New Roman" w:hAnsi="Calibri" w:cs="Calibri"/>
+          <w:color w:val="1A1A1A"/>
+          <w:sz w:val="22"/>
+          <w:szCs w:val="22"/>
+        </w:rPr>
+      </w:pPr>
+      <w:r>
+        <w:rPr>
+          <w:rFonts w:ascii="Calibri" w:eastAsia="Times New Roman" w:hAnsi="Calibri" w:cs="Calibri"/>
+          <w:b/>
+          <w:bCs/>
+          <w:color w:val="1A1A1A"/>
+          <w:sz w:val="22"/>
+          <w:szCs w:val="22"/>
+        </w:rPr>
+        <w:t>Muda por cenário:</w:t>
+      </w:r>
+      <w:r>
+        <w:rPr>
+          <w:rFonts w:ascii="Calibri" w:eastAsia="Times New Roman" w:hAnsi="Calibri" w:cs="Calibri"/>
+          <w:color w:val="1A1A1A"/>
+          <w:sz w:val="22"/>
+          <w:szCs w:val="22"/>
+        </w:rPr>
+        <w:t xml:space="preserve"> preço da lavagem, carros por dia, gasto e tempo de deslocamento.</w:t>
+      </w:r>
+    </w:p>
+    <w:p>
+      <w:pPr>
+        <w:numPr>
+          <w:ilvl w:val="0"/>
+          <w:numId w:val="6"/>
+        </w:numPr>
+        <w:spacing w:before="100" w:beforeAutospacing="1" w:after="80"/>
+        <w:rPr>
+          <w:rFonts w:ascii="Calibri" w:eastAsia="Times New Roman" w:hAnsi="Calibri" w:cs="Calibri"/>
+          <w:color w:val="1A1A1A"/>
+          <w:sz w:val="22"/>
+          <w:szCs w:val="22"/>
+        </w:rPr>
+      </w:pPr>
+      <w:r>
+        <w:rPr>
+          <w:rFonts w:ascii="Calibri" w:eastAsia="Times New Roman" w:hAnsi="Calibri" w:cs="Calibri"/>
+          <w:b/>
+          <w:bCs/>
+          <w:color w:val="1A1A1A"/>
+          <w:sz w:val="22"/>
+          <w:szCs w:val="22"/>
+        </w:rPr>
+        <w:t>Plataforma:</w:t>
+      </w:r>
+      <w:r>
+        <w:rPr>
+          <w:rFonts w:ascii="Calibri" w:eastAsia="Times New Roman" w:hAnsi="Calibri" w:cs="Calibri"/>
+          <w:color w:val="1A1A1A"/>
+          <w:sz w:val="22"/>
+          <w:szCs w:val="22"/>
+        </w:rPr>
+        <w:t xml:space="preserve"> quantos lavadores ativos.</w:t>
+      </w:r>
+    </w:p>
+    <w:p>
+      <w:pPr>
+        <w:pStyle w:val="NormalWeb"/>
+        <w:rPr>
+          <w:rFonts w:ascii="Calibri" w:hAnsi="Calibri" w:cs="Calibri"/>
+          <w:color w:val="1A1A1A"/>
+          <w:sz w:val="22"/>
+          <w:szCs w:val="22"/>
+        </w:rPr>
+      </w:pPr>
+      <w:r>
+        <w:rPr>
+          <w:rFonts w:ascii="Calibri" w:hAnsi="Calibri" w:cs="Calibri"/>
+          <w:color w:val="1A1A1A"/>
+          <w:sz w:val="22"/>
+          <w:szCs w:val="22"/>
+        </w:rPr>
+        <w:t>Ele mostra o ganho do lavador por mês, por dia e por hora, se a jornada cabe no dia, o preço mínimo pra bater a meta, a comanda de cada lavagem e o faturamento da plataforma. Começa com o avulso e o condomínio da tabela acima, e a rota no bairro dá pra testar no cenário A. Guarda o que você mudar no seu navegador.</w:t>
+      </w:r>
+    </w:p>
+    <w:p>
+      <w:pPr>
+        <w:pStyle w:val="Ttulo2"/>
+        <w:rPr>
+          <w:rFonts w:ascii="Calibri" w:eastAsia="Times New Roman" w:hAnsi="Calibri" w:cs="Calibri"/>
+          <w:color w:val="1A1A1A"/>
+        </w:rPr>
+      </w:pPr>
+      <w:r>
+        <w:rPr>
+          <w:rFonts w:ascii="Calibri" w:eastAsia="Times New Roman" w:hAnsi="Calibri" w:cs="Calibri"/>
+          <w:color w:val="1A1A1A"/>
+        </w:rPr>
+        <w:t>Fontes</w:t>
+      </w:r>
+    </w:p>
+    <w:p>
+      <w:pPr>
+        <w:numPr>
+          <w:ilvl w:val="0"/>
+          <w:numId w:val="7"/>
         </w:numPr>
         <w:spacing w:before="100" w:beforeAutospacing="1" w:after="80"/>
         <w:rPr>
@@ -4299,14 +4877,23 @@
           <w:sz w:val="22"/>
           <w:szCs w:val="22"/>
         </w:rPr>
-        <w:t xml:space="preserve"> · Mobile Time, 16/03/2015 (Easy Carros)</w:t>
+        <w:t xml:space="preserve"> </w:t>
+      </w:r>
+      <w:r>
+        <w:rPr>
+          <w:rFonts w:ascii="Calibri" w:eastAsia="Times New Roman" w:hAnsi="Calibri" w:cs="Calibri"/>
+          <w:color w:val="1A1A1A"/>
+          <w:sz w:val="22"/>
+          <w:szCs w:val="22"/>
+        </w:rPr>
+        <w:t>· Mobile Time, 16/03/2015 (Easy Carros)</w:t>
       </w:r>
     </w:p>
     <w:p>
       <w:pPr>
         <w:numPr>
           <w:ilvl w:val="0"/>
-          <w:numId w:val="6"/>
+          <w:numId w:val="7"/>
         </w:numPr>
         <w:spacing w:before="100" w:beforeAutospacing="1" w:after="80"/>
         <w:rPr>
@@ -4341,7 +4928,7 @@
       <w:pPr>
         <w:numPr>
           <w:ilvl w:val="0"/>
-          <w:numId w:val="6"/>
+          <w:numId w:val="7"/>
         </w:numPr>
         <w:spacing w:before="100" w:beforeAutospacing="1" w:after="80"/>
         <w:rPr>
@@ -4376,7 +4963,7 @@
       <w:pPr>
         <w:numPr>
           <w:ilvl w:val="0"/>
-          <w:numId w:val="6"/>
+          <w:numId w:val="7"/>
         </w:numPr>
         <w:spacing w:before="100" w:beforeAutospacing="1" w:after="80"/>
         <w:rPr>
@@ -4411,7 +4998,7 @@
       <w:pPr>
         <w:numPr>
           <w:ilvl w:val="0"/>
-          <w:numId w:val="6"/>
+          <w:numId w:val="7"/>
         </w:numPr>
         <w:spacing w:before="100" w:beforeAutospacing="1" w:after="80"/>
         <w:rPr>
@@ -4439,23 +5026,14 @@
           <w:sz w:val="22"/>
           <w:szCs w:val="22"/>
         </w:rPr>
-        <w:t xml:space="preserve"> </w:t>
-      </w:r>
-      <w:r>
-        <w:rPr>
-          <w:rFonts w:ascii="Calibri" w:eastAsia="Times New Roman" w:hAnsi="Calibri" w:cs="Calibri"/>
-          <w:color w:val="1A1A1A"/>
-          <w:sz w:val="22"/>
-          <w:szCs w:val="22"/>
-        </w:rPr>
-        <w:t>· Wikipédia, em inglês</w:t>
+        <w:t xml:space="preserve"> · Wikipédia, em inglês</w:t>
       </w:r>
     </w:p>
     <w:p>
       <w:pPr>
         <w:numPr>
           <w:ilvl w:val="0"/>
-          <w:numId w:val="6"/>
+          <w:numId w:val="7"/>
         </w:numPr>
         <w:spacing w:before="100" w:beforeAutospacing="1" w:after="80"/>
         <w:rPr>
@@ -4499,9 +5077,122 @@
 <file path=word/numbering.xml><?xml version="1.0" encoding="utf-8"?>
 <w:numbering xmlns:wpc="http://schemas.microsoft.com/office/word/2010/wordprocessingCanvas" xmlns:cx="http://schemas.microsoft.com/office/drawing/2014/chartex" xmlns:cx1="http://schemas.microsoft.com/office/drawing/2015/9/8/chartex" xmlns:cx2="http://schemas.microsoft.com/office/drawing/2015/10/21/chartex" xmlns:cx3="http://schemas.microsoft.com/office/drawing/2016/5/9/chartex" xmlns:cx4="http://schemas.microsoft.com/office/drawing/2016/5/10/chartex" xmlns:cx5="http://schemas.microsoft.com/office/drawing/2016/5/11/chartex" xmlns:cx6="http://schemas.microsoft.com/office/drawing/2016/5/12/chartex" xmlns:cx7="http://schemas.microsoft.com/office/drawing/2016/5/13/chartex" xmlns:cx8="http://schemas.microsoft.com/office/drawing/2016/5/14/chartex" xmlns:mc="http://schemas.openxmlformats.org/markup-compatibility/2006" xmlns:aink="http://schemas.microsoft.com/office/drawing/2016/ink" xmlns:am3d="http://schemas.microsoft.com/office/drawing/2017/model3d" xmlns:o="urn:schemas-microsoft-com:office:office" xmlns:oel="http://schemas.microsoft.com/office/2019/extlst" xmlns:r="http://schemas.openxmlformats.org/officeDocument/2006/relationships" xmlns:m="http://schemas.openxmlformats.org/officeDocument/2006/math" xmlns:v="urn:schemas-microsoft-com:vml" xmlns:wp14="http://schemas.microsoft.com/office/word/2010/wordprocessingDrawing" xmlns:wp="http://schemas.openxmlformats.org/drawingml/2006/wordprocessingDrawing" xmlns:w10="urn:schemas-microsoft-com:office:word" xmlns:w="http://schemas.openxmlformats.org/wordprocessingml/2006/main" xmlns:w14="http://schemas.microsoft.com/office/word/2010/wordml" xmlns:w15="http://schemas.microsoft.com/office/word/2012/wordml" xmlns:w16cex="http://schemas.microsoft.com/office/word/2018/wordml/cex" xmlns:w16cid="http://schemas.microsoft.com/office/word/2016/wordml/cid" xmlns:w16="http://schemas.microsoft.com/office/word/2018/wordml" xmlns:w16du="http://schemas.microsoft.com/office/word/2023/wordml/word16du" xmlns:w16sdtdh="http://schemas.microsoft.com/office/word/2020/wordml/sdtdatahash" xmlns:w16sdtfl="http://schemas.microsoft.com/office/word/2024/wordml/sdtformatlock" xmlns:w16se="http://schemas.microsoft.com/office/word/2015/wordml/symex" xmlns:wpg="http://schemas.microsoft.com/office/word/2010/wordprocessingGroup" xmlns:wpi="http://schemas.microsoft.com/office/word/2010/wordprocessingInk" xmlns:wne="http://schemas.microsoft.com/office/word/2006/wordml" xmlns:wps="http://schemas.microsoft.com/office/word/2010/wordprocessingShape" mc:Ignorable="w14 w15 w16se w16cid w16 w16cex w16sdtdh w16sdtfl w16du wp14">
   <w:abstractNum w:abstractNumId="0" w15:restartNumberingAfterBreak="0">
-    <w:nsid w:val="1B746700"/>
+    <w:nsid w:val="14C4635C"/>
     <w:multiLevelType w:val="multilevel"/>
-    <w:tmpl w:val="578ABB72"/>
+    <w:tmpl w:val="1BA4A1BE"/>
+    <w:lvl w:ilvl="0">
+      <w:start w:val="1"/>
+      <w:numFmt w:val="decimal"/>
+      <w:lvlText w:val="%1."/>
+      <w:lvlJc w:val="left"/>
+      <w:pPr>
+        <w:tabs>
+          <w:tab w:val="num" w:pos="720"/>
+        </w:tabs>
+        <w:ind w:left="720" w:hanging="360"/>
+      </w:pPr>
+    </w:lvl>
+    <w:lvl w:ilvl="1" w:tentative="1">
+      <w:start w:val="1"/>
+      <w:numFmt w:val="decimal"/>
+      <w:lvlText w:val="%2."/>
+      <w:lvlJc w:val="left"/>
+      <w:pPr>
+        <w:tabs>
+          <w:tab w:val="num" w:pos="1440"/>
+        </w:tabs>
+        <w:ind w:left="1440" w:hanging="360"/>
+      </w:pPr>
+    </w:lvl>
+    <w:lvl w:ilvl="2" w:tentative="1">
+      <w:start w:val="1"/>
+      <w:numFmt w:val="decimal"/>
+      <w:lvlText w:val="%3."/>
+      <w:lvlJc w:val="left"/>
+      <w:pPr>
+        <w:tabs>
+          <w:tab w:val="num" w:pos="2160"/>
+        </w:tabs>
+        <w:ind w:left="2160" w:hanging="360"/>
+      </w:pPr>
+    </w:lvl>
+    <w:lvl w:ilvl="3" w:tentative="1">
+      <w:start w:val="1"/>
+      <w:numFmt w:val="decimal"/>
+      <w:lvlText w:val="%4."/>
+      <w:lvlJc w:val="left"/>
+      <w:pPr>
+        <w:tabs>
+          <w:tab w:val="num" w:pos="2880"/>
+        </w:tabs>
+        <w:ind w:left="2880" w:hanging="360"/>
+      </w:pPr>
+    </w:lvl>
+    <w:lvl w:ilvl="4" w:tentative="1">
+      <w:start w:val="1"/>
+      <w:numFmt w:val="decimal"/>
+      <w:lvlText w:val="%5."/>
+      <w:lvlJc w:val="left"/>
+      <w:pPr>
+        <w:tabs>
+          <w:tab w:val="num" w:pos="3600"/>
+        </w:tabs>
+        <w:ind w:left="3600" w:hanging="360"/>
+      </w:pPr>
+    </w:lvl>
+    <w:lvl w:ilvl="5" w:tentative="1">
+      <w:start w:val="1"/>
+      <w:numFmt w:val="decimal"/>
+      <w:lvlText w:val="%6."/>
+      <w:lvlJc w:val="left"/>
+      <w:pPr>
+        <w:tabs>
+          <w:tab w:val="num" w:pos="4320"/>
+        </w:tabs>
+        <w:ind w:left="4320" w:hanging="360"/>
+      </w:pPr>
+    </w:lvl>
+    <w:lvl w:ilvl="6" w:tentative="1">
+      <w:start w:val="1"/>
+      <w:numFmt w:val="decimal"/>
+      <w:lvlText w:val="%7."/>
+      <w:lvlJc w:val="left"/>
+      <w:pPr>
+        <w:tabs>
+          <w:tab w:val="num" w:pos="5040"/>
+        </w:tabs>
+        <w:ind w:left="5040" w:hanging="360"/>
+      </w:pPr>
+    </w:lvl>
+    <w:lvl w:ilvl="7" w:tentative="1">
+      <w:start w:val="1"/>
+      <w:numFmt w:val="decimal"/>
+      <w:lvlText w:val="%8."/>
+      <w:lvlJc w:val="left"/>
+      <w:pPr>
+        <w:tabs>
+          <w:tab w:val="num" w:pos="5760"/>
+        </w:tabs>
+        <w:ind w:left="5760" w:hanging="360"/>
+      </w:pPr>
+    </w:lvl>
+    <w:lvl w:ilvl="8" w:tentative="1">
+      <w:start w:val="1"/>
+      <w:numFmt w:val="decimal"/>
+      <w:lvlText w:val="%9."/>
+      <w:lvlJc w:val="left"/>
+      <w:pPr>
+        <w:tabs>
+          <w:tab w:val="num" w:pos="6480"/>
+        </w:tabs>
+        <w:ind w:left="6480" w:hanging="360"/>
+      </w:pPr>
+    </w:lvl>
+  </w:abstractNum>
+  <w:abstractNum w:abstractNumId="1" w15:restartNumberingAfterBreak="0">
+    <w:nsid w:val="199B17BD"/>
+    <w:multiLevelType w:val="multilevel"/>
+    <w:tmpl w:val="DEFC28B4"/>
     <w:lvl w:ilvl="0">
       <w:start w:val="1"/>
       <w:numFmt w:val="bullet"/>
@@ -4647,10 +5338,10 @@
       </w:rPr>
     </w:lvl>
   </w:abstractNum>
-  <w:abstractNum w:abstractNumId="1" w15:restartNumberingAfterBreak="0">
-    <w:nsid w:val="372712D9"/>
+  <w:abstractNum w:abstractNumId="2" w15:restartNumberingAfterBreak="0">
+    <w:nsid w:val="38CC1DA2"/>
     <w:multiLevelType w:val="multilevel"/>
-    <w:tmpl w:val="76FAC758"/>
+    <w:tmpl w:val="16F62772"/>
     <w:lvl w:ilvl="0">
       <w:start w:val="1"/>
       <w:numFmt w:val="bullet"/>
@@ -4796,10 +5487,10 @@
       </w:rPr>
     </w:lvl>
   </w:abstractNum>
-  <w:abstractNum w:abstractNumId="2" w15:restartNumberingAfterBreak="0">
-    <w:nsid w:val="3EE50577"/>
+  <w:abstractNum w:abstractNumId="3" w15:restartNumberingAfterBreak="0">
+    <w:nsid w:val="3AEC2F25"/>
     <w:multiLevelType w:val="multilevel"/>
-    <w:tmpl w:val="6448A844"/>
+    <w:tmpl w:val="D1C28F0E"/>
     <w:lvl w:ilvl="0">
       <w:start w:val="1"/>
       <w:numFmt w:val="bullet"/>
@@ -4945,10 +5636,123 @@
       </w:rPr>
     </w:lvl>
   </w:abstractNum>
-  <w:abstractNum w:abstractNumId="3" w15:restartNumberingAfterBreak="0">
-    <w:nsid w:val="4AD50032"/>
+  <w:abstractNum w:abstractNumId="4" w15:restartNumberingAfterBreak="0">
+    <w:nsid w:val="553E66CB"/>
     <w:multiLevelType w:val="multilevel"/>
-    <w:tmpl w:val="77CC3A96"/>
+    <w:tmpl w:val="E3560502"/>
+    <w:lvl w:ilvl="0">
+      <w:start w:val="1"/>
+      <w:numFmt w:val="decimal"/>
+      <w:lvlText w:val="%1."/>
+      <w:lvlJc w:val="left"/>
+      <w:pPr>
+        <w:tabs>
+          <w:tab w:val="num" w:pos="720"/>
+        </w:tabs>
+        <w:ind w:left="720" w:hanging="360"/>
+      </w:pPr>
+    </w:lvl>
+    <w:lvl w:ilvl="1" w:tentative="1">
+      <w:start w:val="1"/>
+      <w:numFmt w:val="decimal"/>
+      <w:lvlText w:val="%2."/>
+      <w:lvlJc w:val="left"/>
+      <w:pPr>
+        <w:tabs>
+          <w:tab w:val="num" w:pos="1440"/>
+        </w:tabs>
+        <w:ind w:left="1440" w:hanging="360"/>
+      </w:pPr>
+    </w:lvl>
+    <w:lvl w:ilvl="2" w:tentative="1">
+      <w:start w:val="1"/>
+      <w:numFmt w:val="decimal"/>
+      <w:lvlText w:val="%3."/>
+      <w:lvlJc w:val="left"/>
+      <w:pPr>
+        <w:tabs>
+          <w:tab w:val="num" w:pos="2160"/>
+        </w:tabs>
+        <w:ind w:left="2160" w:hanging="360"/>
+      </w:pPr>
+    </w:lvl>
+    <w:lvl w:ilvl="3" w:tentative="1">
+      <w:start w:val="1"/>
+      <w:numFmt w:val="decimal"/>
+      <w:lvlText w:val="%4."/>
+      <w:lvlJc w:val="left"/>
+      <w:pPr>
+        <w:tabs>
+          <w:tab w:val="num" w:pos="2880"/>
+        </w:tabs>
+        <w:ind w:left="2880" w:hanging="360"/>
+      </w:pPr>
+    </w:lvl>
+    <w:lvl w:ilvl="4" w:tentative="1">
+      <w:start w:val="1"/>
+      <w:numFmt w:val="decimal"/>
+      <w:lvlText w:val="%5."/>
+      <w:lvlJc w:val="left"/>
+      <w:pPr>
+        <w:tabs>
+          <w:tab w:val="num" w:pos="3600"/>
+        </w:tabs>
+        <w:ind w:left="3600" w:hanging="360"/>
+      </w:pPr>
+    </w:lvl>
+    <w:lvl w:ilvl="5" w:tentative="1">
+      <w:start w:val="1"/>
+      <w:numFmt w:val="decimal"/>
+      <w:lvlText w:val="%6."/>
+      <w:lvlJc w:val="left"/>
+      <w:pPr>
+        <w:tabs>
+          <w:tab w:val="num" w:pos="4320"/>
+        </w:tabs>
+        <w:ind w:left="4320" w:hanging="360"/>
+      </w:pPr>
+    </w:lvl>
+    <w:lvl w:ilvl="6" w:tentative="1">
+      <w:start w:val="1"/>
+      <w:numFmt w:val="decimal"/>
+      <w:lvlText w:val="%7."/>
+      <w:lvlJc w:val="left"/>
+      <w:pPr>
+        <w:tabs>
+          <w:tab w:val="num" w:pos="5040"/>
+        </w:tabs>
+        <w:ind w:left="5040" w:hanging="360"/>
+      </w:pPr>
+    </w:lvl>
+    <w:lvl w:ilvl="7" w:tentative="1">
+      <w:start w:val="1"/>
+      <w:numFmt w:val="decimal"/>
+      <w:lvlText w:val="%8."/>
+      <w:lvlJc w:val="left"/>
+      <w:pPr>
+        <w:tabs>
+          <w:tab w:val="num" w:pos="5760"/>
+        </w:tabs>
+        <w:ind w:left="5760" w:hanging="360"/>
+      </w:pPr>
+    </w:lvl>
+    <w:lvl w:ilvl="8" w:tentative="1">
+      <w:start w:val="1"/>
+      <w:numFmt w:val="decimal"/>
+      <w:lvlText w:val="%9."/>
+      <w:lvlJc w:val="left"/>
+      <w:pPr>
+        <w:tabs>
+          <w:tab w:val="num" w:pos="6480"/>
+        </w:tabs>
+        <w:ind w:left="6480" w:hanging="360"/>
+      </w:pPr>
+    </w:lvl>
+  </w:abstractNum>
+  <w:abstractNum w:abstractNumId="5" w15:restartNumberingAfterBreak="0">
+    <w:nsid w:val="5AA2359E"/>
+    <w:multiLevelType w:val="multilevel"/>
+    <w:tmpl w:val="65A6FC02"/>
     <w:lvl w:ilvl="0">
       <w:start w:val="1"/>
       <w:numFmt w:val="bullet"/>
@@ -5094,123 +5898,10 @@
       </w:rPr>
     </w:lvl>
   </w:abstractNum>
-  <w:abstractNum w:abstractNumId="4" w15:restartNumberingAfterBreak="0">
-    <w:nsid w:val="72E468C8"/>
+  <w:abstractNum w:abstractNumId="6" w15:restartNumberingAfterBreak="0">
+    <w:nsid w:val="70F95417"/>
     <w:multiLevelType w:val="multilevel"/>
-    <w:tmpl w:val="15443BD4"/>
-    <w:lvl w:ilvl="0">
-      <w:start w:val="1"/>
-      <w:numFmt w:val="decimal"/>
-      <w:lvlText w:val="%1."/>
-      <w:lvlJc w:val="left"/>
-      <w:pPr>
-        <w:tabs>
-          <w:tab w:val="num" w:pos="720"/>
-        </w:tabs>
-        <w:ind w:left="720" w:hanging="360"/>
-      </w:pPr>
-    </w:lvl>
-    <w:lvl w:ilvl="1" w:tentative="1">
-      <w:start w:val="1"/>
-      <w:numFmt w:val="decimal"/>
-      <w:lvlText w:val="%2."/>
-      <w:lvlJc w:val="left"/>
-      <w:pPr>
-        <w:tabs>
-          <w:tab w:val="num" w:pos="1440"/>
-        </w:tabs>
-        <w:ind w:left="1440" w:hanging="360"/>
-      </w:pPr>
-    </w:lvl>
-    <w:lvl w:ilvl="2" w:tentative="1">
-      <w:start w:val="1"/>
-      <w:numFmt w:val="decimal"/>
-      <w:lvlText w:val="%3."/>
-      <w:lvlJc w:val="left"/>
-      <w:pPr>
-        <w:tabs>
-          <w:tab w:val="num" w:pos="2160"/>
-        </w:tabs>
-        <w:ind w:left="2160" w:hanging="360"/>
-      </w:pPr>
-    </w:lvl>
-    <w:lvl w:ilvl="3" w:tentative="1">
-      <w:start w:val="1"/>
-      <w:numFmt w:val="decimal"/>
-      <w:lvlText w:val="%4."/>
-      <w:lvlJc w:val="left"/>
-      <w:pPr>
-        <w:tabs>
-          <w:tab w:val="num" w:pos="2880"/>
-        </w:tabs>
-        <w:ind w:left="2880" w:hanging="360"/>
-      </w:pPr>
-    </w:lvl>
-    <w:lvl w:ilvl="4" w:tentative="1">
-      <w:start w:val="1"/>
-      <w:numFmt w:val="decimal"/>
-      <w:lvlText w:val="%5."/>
-      <w:lvlJc w:val="left"/>
-      <w:pPr>
-        <w:tabs>
-          <w:tab w:val="num" w:pos="3600"/>
-        </w:tabs>
-        <w:ind w:left="3600" w:hanging="360"/>
-      </w:pPr>
-    </w:lvl>
-    <w:lvl w:ilvl="5" w:tentative="1">
-      <w:start w:val="1"/>
-      <w:numFmt w:val="decimal"/>
-      <w:lvlText w:val="%6."/>
-      <w:lvlJc w:val="left"/>
-      <w:pPr>
-        <w:tabs>
-          <w:tab w:val="num" w:pos="4320"/>
-        </w:tabs>
-        <w:ind w:left="4320" w:hanging="360"/>
-      </w:pPr>
-    </w:lvl>
-    <w:lvl w:ilvl="6" w:tentative="1">
-      <w:start w:val="1"/>
-      <w:numFmt w:val="decimal"/>
-      <w:lvlText w:val="%7."/>
-      <w:lvlJc w:val="left"/>
-      <w:pPr>
-        <w:tabs>
-          <w:tab w:val="num" w:pos="5040"/>
-        </w:tabs>
-        <w:ind w:left="5040" w:hanging="360"/>
-      </w:pPr>
-    </w:lvl>
-    <w:lvl w:ilvl="7" w:tentative="1">
-      <w:start w:val="1"/>
-      <w:numFmt w:val="decimal"/>
-      <w:lvlText w:val="%8."/>
-      <w:lvlJc w:val="left"/>
-      <w:pPr>
-        <w:tabs>
-          <w:tab w:val="num" w:pos="5760"/>
-        </w:tabs>
-        <w:ind w:left="5760" w:hanging="360"/>
-      </w:pPr>
-    </w:lvl>
-    <w:lvl w:ilvl="8" w:tentative="1">
-      <w:start w:val="1"/>
-      <w:numFmt w:val="decimal"/>
-      <w:lvlText w:val="%9."/>
-      <w:lvlJc w:val="left"/>
-      <w:pPr>
-        <w:tabs>
-          <w:tab w:val="num" w:pos="6480"/>
-        </w:tabs>
-        <w:ind w:left="6480" w:hanging="360"/>
-      </w:pPr>
-    </w:lvl>
-  </w:abstractNum>
-  <w:abstractNum w:abstractNumId="5" w15:restartNumberingAfterBreak="0">
-    <w:nsid w:val="755A4253"/>
-    <w:multiLevelType w:val="multilevel"/>
-    <w:tmpl w:val="381C1D92"/>
+    <w:tmpl w:val="92CAD62E"/>
     <w:lvl w:ilvl="0">
       <w:start w:val="1"/>
       <w:numFmt w:val="bullet"/>
@@ -5356,23 +6047,26 @@
       </w:rPr>
     </w:lvl>
   </w:abstractNum>
-  <w:num w:numId="1" w16cid:durableId="1898474024">
-    <w:abstractNumId w:val="2"/>
+  <w:num w:numId="1" w16cid:durableId="1233196949">
+    <w:abstractNumId w:val="4"/>
   </w:num>
-  <w:num w:numId="2" w16cid:durableId="131483970">
+  <w:num w:numId="2" w16cid:durableId="968781403">
+    <w:abstractNumId w:val="5"/>
+  </w:num>
+  <w:num w:numId="3" w16cid:durableId="705182832">
+    <w:abstractNumId w:val="6"/>
+  </w:num>
+  <w:num w:numId="4" w16cid:durableId="1863857976">
+    <w:abstractNumId w:val="1"/>
+  </w:num>
+  <w:num w:numId="5" w16cid:durableId="807940417">
+    <w:abstractNumId w:val="0"/>
+  </w:num>
+  <w:num w:numId="6" w16cid:durableId="1472749989">
     <w:abstractNumId w:val="3"/>
   </w:num>
-  <w:num w:numId="3" w16cid:durableId="1627395829">
-    <w:abstractNumId w:val="5"/>
-  </w:num>
-  <w:num w:numId="4" w16cid:durableId="1090194759">
-    <w:abstractNumId w:val="4"/>
-  </w:num>
-  <w:num w:numId="5" w16cid:durableId="1486774259">
-    <w:abstractNumId w:val="0"/>
-  </w:num>
-  <w:num w:numId="6" w16cid:durableId="2092001125">
-    <w:abstractNumId w:val="1"/>
+  <w:num w:numId="7" w16cid:durableId="1278947334">
+    <w:abstractNumId w:val="2"/>
   </w:num>
 </w:numbering>
 </file>

</xml_diff>